<commit_message>
release: freeze v1.0.14 reviewer-friendly visual package
</commit_message>
<xml_diff>
--- a/submission/JMS_26-11479_Main_Manuscript_Anonymous.docx
+++ b/submission/JMS_26-11479_Main_Manuscript_Anonymous.docx
@@ -2367,7 +2367,7 @@
                 <w:bCs/>
                 <w:sz w:val="17"/>
               </w:rPr>
-              <w:t xml:space="preserve">Event Name</w:t>
+              <w:t xml:space="preserve">Acquisition Date</w:t>
             </w:r>
           </w:p>
         </w:tc>
@@ -2516,7 +2516,7 @@
                 <w:rFonts w:ascii="Times New Roman" w:hAnsi="Times New Roman" w:eastAsia="Times New Roman"/>
                 <w:sz w:val="17"/>
               </w:rPr>
-              <w:t xml:space="preserve">Livigno_20240403</w:t>
+              <w:t xml:space="preserve">3 Apr 2024</w:t>
             </w:r>
           </w:p>
         </w:tc>
@@ -2644,7 +2644,7 @@
                 <w:rFonts w:ascii="Times New Roman" w:hAnsi="Times New Roman" w:eastAsia="Times New Roman"/>
                 <w:sz w:val="17"/>
               </w:rPr>
-              <w:t xml:space="preserve">Livigno_20250129</w:t>
+              <w:t xml:space="preserve">29 Jan 2025</w:t>
             </w:r>
           </w:p>
         </w:tc>
@@ -2772,7 +2772,7 @@
                 <w:rFonts w:ascii="Times New Roman" w:hAnsi="Times New Roman" w:eastAsia="Times New Roman"/>
                 <w:sz w:val="17"/>
               </w:rPr>
-              <w:t xml:space="preserve">Livigno_20250318</w:t>
+              <w:t xml:space="preserve">18 Mar 2025</w:t>
             </w:r>
           </w:p>
         </w:tc>
@@ -2911,7 +2911,7 @@
                 <w:rFonts w:ascii="Times New Roman" w:hAnsi="Times New Roman" w:eastAsia="Times New Roman"/>
                 <w:sz w:val="17"/>
               </w:rPr>
-              <w:t xml:space="preserve">Nuuk_20160413</w:t>
+              <w:t xml:space="preserve">13 Apr 2016</w:t>
             </w:r>
           </w:p>
         </w:tc>
@@ -3039,7 +3039,7 @@
                 <w:rFonts w:ascii="Times New Roman" w:hAnsi="Times New Roman" w:eastAsia="Times New Roman"/>
                 <w:sz w:val="17"/>
               </w:rPr>
-              <w:t xml:space="preserve">Nuuk_20210411</w:t>
+              <w:t xml:space="preserve">11 Apr 2021</w:t>
             </w:r>
           </w:p>
         </w:tc>
@@ -3177,7 +3177,7 @@
                 <w:rFonts w:ascii="Times New Roman" w:hAnsi="Times New Roman" w:eastAsia="Times New Roman"/>
                 <w:sz w:val="17"/>
               </w:rPr>
-              <w:t xml:space="preserve">Pish_20230221</w:t>
+              <w:t xml:space="preserve">21 Feb 2023</w:t>
             </w:r>
           </w:p>
         </w:tc>
@@ -3315,7 +3315,7 @@
                 <w:rFonts w:ascii="Times New Roman" w:hAnsi="Times New Roman" w:eastAsia="Times New Roman"/>
                 <w:sz w:val="17"/>
               </w:rPr>
-              <w:t xml:space="preserve">Tromso_20241220</w:t>
+              <w:t xml:space="preserve">20 Dec 2024</w:t>
             </w:r>
           </w:p>
         </w:tc>
@@ -8691,7 +8691,7 @@
         </w:rPr>
         <w:drawing>
           <wp:inline>
-            <wp:extent cx="3627120" cy="2061456"/>
+            <wp:extent cx="5120640" cy="2586181"/>
             <wp:effectExtent b="0" l="0" r="0" t="0"/>
             <wp:docPr descr="" title="" id="17" name="Picture"/>
             <a:graphic>
@@ -8712,7 +8712,7 @@
                   <pic:spPr bwMode="auto">
                     <a:xfrm>
                       <a:off x="0" y="0"/>
-                      <a:ext cx="3627120" cy="2061456"/>
+                      <a:ext cx="5120640" cy="2586181"/>
                     </a:xfrm>
                     <a:prstGeom prst="rect">
                       <a:avLst/>
@@ -13701,29 +13701,7 @@
           <w:rFonts w:ascii="Times New Roman" w:hAnsi="Times New Roman" w:eastAsia="Times New Roman"/>
           <w:sz w:val="20"/>
         </w:rPr>
-        <w:t xml:space="preserve">seconds on Apple MPS hardware (profiling artifact preserved in</w:t>
-      </w:r>
-      <w:r>
-        <w:rPr>
-          <w:rFonts w:ascii="Times New Roman" w:hAnsi="Times New Roman" w:eastAsia="Times New Roman"/>
-          <w:sz w:val="20"/>
-        </w:rPr>
-        <w:t xml:space="preserve"> </w:t>
-      </w:r>
-      <w:r>
-        <w:rPr>
-          <w:rStyle w:val="VerbatimChar"/>
-          <w:rFonts w:ascii="Times New Roman" w:hAnsi="Times New Roman" w:eastAsia="Times New Roman"/>
-          <w:sz w:val="20"/>
-        </w:rPr>
-        <w:t xml:space="preserve">inference_profile.json</w:t>
-      </w:r>
-      <w:r>
-        <w:rPr>
-          <w:rFonts w:ascii="Times New Roman" w:hAnsi="Times New Roman" w:eastAsia="Times New Roman"/>
-          <w:sz w:val="20"/>
-        </w:rPr>
-        <w:t xml:space="preserve">), with TopoRadar-Net maintaining a compact parameter footprint of 3.46M parameters (3,455,729 parameters).</w:t>
+        <w:t xml:space="preserve">seconds on Apple MPS hardware, with TopoRadar-Net maintaining a compact parameter footprint of 3.46M parameters (3,455,729 parameters).</w:t>
       </w:r>
     </w:p>
     <w:p>
@@ -20908,7 +20886,7 @@
         </w:rPr>
         <w:drawing>
           <wp:inline>
-            <wp:extent cx="5334000" cy="2423211"/>
+            <wp:extent cx="5334000" cy="2397120"/>
             <wp:effectExtent b="0" l="0" r="0" t="0"/>
             <wp:docPr descr="" title="" id="32" name="Picture"/>
             <a:graphic>
@@ -20929,7 +20907,7 @@
                   <pic:spPr bwMode="auto">
                     <a:xfrm>
                       <a:off x="0" y="0"/>
-                      <a:ext cx="5334000" cy="2423211"/>
+                      <a:ext cx="5334000" cy="2397120"/>
                     </a:xfrm>
                     <a:prstGeom prst="rect">
                       <a:avLst/>
@@ -23417,29 +23395,7 @@
           <w:rFonts w:ascii="Times New Roman" w:hAnsi="Times New Roman" w:eastAsia="Times New Roman"/>
           <w:sz w:val="20"/>
         </w:rPr>
-        <w:t xml:space="preserve">). Thus Geo-Loss is a precision–recall heuristic with a documented positive-label conflict, not a physical-admissibility mechanism (artifact</w:t>
-      </w:r>
-      <w:r>
-        <w:rPr>
-          <w:rFonts w:ascii="Times New Roman" w:hAnsi="Times New Roman" w:eastAsia="Times New Roman"/>
-          <w:sz w:val="20"/>
-        </w:rPr>
-        <w:t xml:space="preserve"> </w:t>
-      </w:r>
-      <w:r>
-        <w:rPr>
-          <w:rStyle w:val="VerbatimChar"/>
-          <w:rFonts w:ascii="Times New Roman" w:hAnsi="Times New Roman" w:eastAsia="Times New Roman"/>
-          <w:sz w:val="20"/>
-        </w:rPr>
-        <w:t xml:space="preserve">geoloss_construct_audit.json</w:t>
-      </w:r>
-      <w:r>
-        <w:rPr>
-          <w:rFonts w:ascii="Times New Roman" w:hAnsi="Times New Roman" w:eastAsia="Times New Roman"/>
-          <w:sz w:val="20"/>
-        </w:rPr>
-        <w:t xml:space="preserve">).</w:t>
+        <w:t xml:space="preserve">). Thus Geo-Loss is a precision–recall heuristic with a documented positive-label conflict, not a physical-admissibility mechanism.</w:t>
       </w:r>
     </w:p>
     <w:p>
@@ -27558,22 +27514,7 @@
           <w:rFonts w:ascii="Times New Roman" w:hAnsi="Times New Roman" w:eastAsia="Times New Roman"/>
           <w:sz w:val="20"/>
         </w:rPr>
-        <w:t xml:space="preserve">To evaluate model stability across the broader AvalCD distribution beyond the zero-shot test scenes, Table 7 reports performance on the polar maritime validation cohort in Southwest Greenland (</w:t>
-      </w:r>
-      <w:r>
-        <w:rPr>
-          <w:rStyle w:val="VerbatimChar"/>
-          <w:rFonts w:ascii="Times New Roman" w:hAnsi="Times New Roman" w:eastAsia="Times New Roman"/>
-          <w:sz w:val="20"/>
-        </w:rPr>
-        <w:t xml:space="preserve">Nuuk_20210411</w:t>
-      </w:r>
-      <w:r>
-        <w:rPr>
-          <w:rFonts w:ascii="Times New Roman" w:hAnsi="Times New Roman" w:eastAsia="Times New Roman"/>
-          <w:sz w:val="20"/>
-        </w:rPr>
-        <w:t xml:space="preserve">, used for checkpoint selection and threshold calibration;</w:t>
+        <w:t xml:space="preserve">To evaluate model stability across the broader AvalCD distribution beyond the zero-shot test scenes, Table 7 reports performance on the 11 April 2021 polar-maritime validation cohort in Southwest Greenland (used for checkpoint selection and threshold calibration;</w:t>
       </w:r>
       <w:r>
         <w:rPr>
@@ -27637,22 +27578,7 @@
           <w:rFonts w:ascii="Times New Roman" w:hAnsi="Times New Roman" w:eastAsia="Times New Roman"/>
           <w:sz w:val="20"/>
         </w:rPr>
-        <w:t xml:space="preserve">Performance comparison on the polar maritime validation scene in Southwest Greenland (</w:t>
-      </w:r>
-      <w:r>
-        <w:rPr>
-          <w:rStyle w:val="VerbatimChar"/>
-          <w:rFonts w:ascii="Times New Roman" w:hAnsi="Times New Roman" w:eastAsia="Times New Roman"/>
-          <w:sz w:val="20"/>
-        </w:rPr>
-        <w:t xml:space="preserve">Nuuk_20210411</w:t>
-      </w:r>
-      <w:r>
-        <w:rPr>
-          <w:rFonts w:ascii="Times New Roman" w:hAnsi="Times New Roman" w:eastAsia="Times New Roman"/>
-          <w:sz w:val="20"/>
-        </w:rPr>
-        <w:t xml:space="preserve">, used for checkpoint selection and threshold calibration; n=129 verified avalanche polygons, 81,595 debris pixels) across 3 independent training seeds (Mean ± Standard Deviation).</w:t>
+        <w:t xml:space="preserve">Performance on the 11 April 2021 polar-maritime validation scene in Southwest Greenland (used for checkpoint selection and threshold calibration; n=129 polygons, 81,595 debris pixels) across three seeds (mean ± SD).</w:t>
       </w:r>
     </w:p>
     <w:tbl>
@@ -32843,7 +32769,7 @@
           <w:rFonts w:ascii="Times New Roman" w:hAnsi="Times New Roman" w:eastAsia="Times New Roman"/>
           <w:sz w:val="20"/>
         </w:rPr>
-        <w:t xml:space="preserve">TopoRadar-Net provides an evaluated all-weather remote-sensing approach for avalanche-debris mapping while explicitly delimiting non-significant competitive-baseline differences, regional failure modes, non-equivariant checkpoint-era augmentation, and the conceptual status of operational triage.</w:t>
+        <w:t xml:space="preserve">Overall, terrain conditioning is useful but not uniformly superior. The main contribution is a reproducible account of where it helps, where it fails, and what evidence is still required before operational use.</w:t>
       </w:r>
     </w:p>
     <w:bookmarkEnd w:id="47"/>

</xml_diff>

<commit_message>
release: freeze v1.0.16 final presentation package
</commit_message>
<xml_diff>
--- a/submission/JMS_26-11479_Main_Manuscript_Anonymous.docx
+++ b/submission/JMS_26-11479_Main_Manuscript_Anonymous.docx
@@ -8691,7 +8691,7 @@
         </w:rPr>
         <w:drawing>
           <wp:inline>
-            <wp:extent cx="5120640" cy="2586181"/>
+            <wp:extent cx="5120640" cy="2566416"/>
             <wp:effectExtent b="0" l="0" r="0" t="0"/>
             <wp:docPr descr="" title="" id="17" name="Picture"/>
             <a:graphic>
@@ -8712,7 +8712,7 @@
                   <pic:spPr bwMode="auto">
                     <a:xfrm>
                       <a:off x="0" y="0"/>
-                      <a:ext cx="5120640" cy="2586181"/>
+                      <a:ext cx="5120640" cy="2566416"/>
                     </a:xfrm>
                     <a:prstGeom prst="rect">
                       <a:avLst/>
@@ -8757,7 +8757,7 @@
           <w:rFonts w:ascii="Times New Roman" w:hAnsi="Times New Roman" w:eastAsia="Times New Roman"/>
           <w:sz w:val="20"/>
         </w:rPr>
-        <w:t xml:space="preserve">Overall architecture of TopoRadar-Net. Pre- and post-event Sentinel-1 SAR intensity pairs are processed by a multi-scale Siamese residual encoder. Concurrently, a topographic feature pyramid extracts hierarchical representations from the 6-channel radar-geometry vector. At each decoder stage, the Radar-Topographic Cross-Attention Block (RTCAB) uses SAR difference features to query regionally-pooled terrain geometry, followed by spatial gating that conditions pixel features on terrain context.</w:t>
+        <w:t xml:space="preserve">Overall architecture of TopoRadar-Net. Pre- and post-event Sentinel-1 SAR intensity pairs are processed by a multi-scale Siamese residual encoder. Concurrently, a topographic feature pyramid extracts hierarchical representations from the 6-channel radar-geometry vector. At each decoder stage, the Radar-Topographic Cross-Attention Block (RTCAB) uses SAR difference features to query regionally-pooled terrain geometry, followed by spatial gating that conditions pixel features on terrain context. This simplified training schematic omits the ground-truth target input to Geo-Loss for clarity.</w:t>
       </w:r>
     </w:p>
     <w:p>
@@ -13899,14 +13899,14 @@
         <w:tblLook w:firstRow="0" w:lastRow="0" w:firstColumn="0" w:lastColumn="0" w:noHBand="0" w:noVBand="0" w:val="0000"/>
       </w:tblPr>
       <w:tblGrid>
-        <w:gridCol w:w="990"/>
-        <w:gridCol w:w="990"/>
-        <w:gridCol w:w="990"/>
-        <w:gridCol w:w="990"/>
-        <w:gridCol w:w="990"/>
-        <w:gridCol w:w="990"/>
-        <w:gridCol w:w="990"/>
-        <w:gridCol w:w="990"/>
+        <w:gridCol w:w="2268"/>
+        <w:gridCol w:w="680"/>
+        <w:gridCol w:w="1020"/>
+        <w:gridCol w:w="1020"/>
+        <w:gridCol w:w="1020"/>
+        <w:gridCol w:w="1020"/>
+        <w:gridCol w:w="964"/>
+        <w:gridCol w:w="964"/>
       </w:tblGrid>
       <w:tr>
         <w:trPr>
@@ -13915,7 +13915,7 @@
         </w:trPr>
         <w:tc>
           <w:tcPr>
-            <w:tcW w:type="dxa" w:w="1814"/>
+            <w:tcW w:type="dxa" w:w="2268"/>
             <w:vMerge w:val="restart"/>
             <w:vAlign w:val="center"/>
           </w:tcPr>
@@ -13930,7 +13930,7 @@
                 <w:rFonts w:ascii="Times New Roman" w:hAnsi="Times New Roman" w:eastAsia="Times New Roman"/>
                 <w:b/>
                 <w:bCs/>
-                <w:sz w:val="17"/>
+                <w:sz w:val="16"/>
               </w:rPr>
               <w:t xml:space="preserve">Method</w:t>
             </w:r>
@@ -13938,7 +13938,7 @@
         </w:tc>
         <w:tc>
           <w:tcPr>
-            <w:tcW w:type="dxa" w:w="737"/>
+            <w:tcW w:type="dxa" w:w="680"/>
             <w:vMerge w:val="restart"/>
             <w:vAlign w:val="center"/>
           </w:tcPr>
@@ -13953,7 +13953,7 @@
                 <w:rFonts w:ascii="Times New Roman" w:hAnsi="Times New Roman" w:eastAsia="Times New Roman"/>
                 <w:b/>
                 <w:bCs/>
-                <w:sz w:val="17"/>
+                <w:sz w:val="16"/>
               </w:rPr>
               <w:t xml:space="preserve">Params</w:t>
             </w:r>
@@ -13976,7 +13976,7 @@
                 <w:rFonts w:ascii="Times New Roman" w:hAnsi="Times New Roman" w:eastAsia="Times New Roman"/>
                 <w:b/>
                 <w:bCs/>
-                <w:sz w:val="17"/>
+                <w:sz w:val="16"/>
               </w:rPr>
               <w:t xml:space="preserve">Scandinavian Arctic (Troms</w:t>
             </w:r>
@@ -13985,7 +13985,7 @@
                 <w:rFonts w:ascii="Times New Roman" w:hAnsi="Times New Roman" w:eastAsia="Times New Roman"/>
                 <w:b/>
                 <w:bCs/>
-                <w:sz w:val="17"/>
+                <w:sz w:val="16"/>
               </w:rPr>
               <w:t xml:space="preserve">ø</w:t>
             </w:r>
@@ -13994,7 +13994,7 @@
                 <w:rFonts w:ascii="Times New Roman" w:hAnsi="Times New Roman" w:eastAsia="Times New Roman"/>
                 <w:b/>
                 <w:bCs/>
-                <w:sz w:val="17"/>
+                <w:sz w:val="16"/>
               </w:rPr>
               <w:t xml:space="preserve">)</w:t>
             </w:r>
@@ -14002,7 +14002,7 @@
         </w:tc>
         <w:tc>
           <w:tcPr>
-            <w:tcW w:type="dxa" w:w="907"/>
+            <w:tcW w:type="dxa" w:w="964"/>
             <w:gridSpan w:val="2"/>
             <w:vAlign w:val="center"/>
           </w:tcPr>
@@ -14017,7 +14017,7 @@
                 <w:rFonts w:ascii="Times New Roman" w:hAnsi="Times New Roman" w:eastAsia="Times New Roman"/>
                 <w:b/>
                 <w:bCs/>
-                <w:sz w:val="17"/>
+                <w:sz w:val="16"/>
               </w:rPr>
               <w:t xml:space="preserve">Pamir Mountains (Pish)</w:t>
             </w:r>
@@ -14025,7 +14025,7 @@
         </w:tc>
         <w:tc>
           <w:tcPr>
-            <w:tcW w:type="dxa" w:w="1020"/>
+            <w:tcW w:type="dxa" w:w="964"/>
             <w:vAlign w:val="center"/>
           </w:tcPr>
           <w:p>
@@ -14039,7 +14039,7 @@
                 <w:rFonts w:ascii="Times New Roman" w:hAnsi="Times New Roman" w:eastAsia="Times New Roman"/>
                 <w:b/>
                 <w:bCs/>
-                <w:sz w:val="17"/>
+                <w:sz w:val="16"/>
               </w:rPr>
               <w:t xml:space="preserve">Pooled</w:t>
             </w:r>
@@ -14071,7 +14071,7 @@
         </w:tc>
         <w:tc>
           <w:tcPr>
-            <w:tcW w:type="dxa" w:w="1247"/>
+            <w:tcW w:type="dxa" w:w="1020"/>
             <w:vAlign w:val="center"/>
           </w:tcPr>
           <w:p>
@@ -14085,7 +14085,7 @@
                 <w:rFonts w:ascii="Times New Roman" w:hAnsi="Times New Roman" w:eastAsia="Times New Roman"/>
                 <w:b/>
                 <w:bCs/>
-                <w:sz w:val="17"/>
+                <w:sz w:val="16"/>
               </w:rPr>
               <w:t xml:space="preserve">F1 (%)</w:t>
             </w:r>
@@ -14107,7 +14107,7 @@
                 <w:rFonts w:ascii="Times New Roman" w:hAnsi="Times New Roman" w:eastAsia="Times New Roman"/>
                 <w:b/>
                 <w:bCs/>
-                <w:sz w:val="17"/>
+                <w:sz w:val="16"/>
               </w:rPr>
               <w:t xml:space="preserve">IoU (%)</w:t>
             </w:r>
@@ -14129,7 +14129,7 @@
                 <w:rFonts w:ascii="Times New Roman" w:hAnsi="Times New Roman" w:eastAsia="Times New Roman"/>
                 <w:b/>
                 <w:bCs/>
-                <w:sz w:val="17"/>
+                <w:sz w:val="16"/>
               </w:rPr>
               <w:t xml:space="preserve">HR@0.3</w:t>
             </w:r>
@@ -14137,7 +14137,7 @@
         </w:tc>
         <w:tc>
           <w:tcPr>
-            <w:tcW w:type="dxa" w:w="1247"/>
+            <w:tcW w:type="dxa" w:w="1020"/>
             <w:vAlign w:val="center"/>
           </w:tcPr>
           <w:p>
@@ -14151,7 +14151,7 @@
                 <w:rFonts w:ascii="Times New Roman" w:hAnsi="Times New Roman" w:eastAsia="Times New Roman"/>
                 <w:b/>
                 <w:bCs/>
-                <w:sz w:val="17"/>
+                <w:sz w:val="16"/>
               </w:rPr>
               <w:t xml:space="preserve">F1 (%)</w:t>
             </w:r>
@@ -14159,7 +14159,7 @@
         </w:tc>
         <w:tc>
           <w:tcPr>
-            <w:tcW w:type="dxa" w:w="907"/>
+            <w:tcW w:type="dxa" w:w="964"/>
             <w:vAlign w:val="center"/>
           </w:tcPr>
           <w:p>
@@ -14173,7 +14173,7 @@
                 <w:rFonts w:ascii="Times New Roman" w:hAnsi="Times New Roman" w:eastAsia="Times New Roman"/>
                 <w:b/>
                 <w:bCs/>
-                <w:sz w:val="17"/>
+                <w:sz w:val="16"/>
               </w:rPr>
               <w:t xml:space="preserve">IoU (%)</w:t>
             </w:r>
@@ -14181,7 +14181,7 @@
         </w:tc>
         <w:tc>
           <w:tcPr>
-            <w:tcW w:type="dxa" w:w="1020"/>
+            <w:tcW w:type="dxa" w:w="964"/>
             <w:vAlign w:val="center"/>
           </w:tcPr>
           <w:p>
@@ -14195,7 +14195,7 @@
                 <w:rFonts w:ascii="Times New Roman" w:hAnsi="Times New Roman" w:eastAsia="Times New Roman"/>
                 <w:b/>
                 <w:bCs/>
-                <w:sz w:val="17"/>
+                <w:sz w:val="16"/>
               </w:rPr>
               <w:t xml:space="preserve">Macro F1 (%)</w:t>
             </w:r>
@@ -14208,7 +14208,7 @@
         </w:trPr>
         <w:tc>
           <w:tcPr>
-            <w:tcW w:type="dxa" w:w="1814"/>
+            <w:tcW w:type="dxa" w:w="2268"/>
             <w:vAlign w:val="center"/>
           </w:tcPr>
           <w:p>
@@ -14220,7 +14220,7 @@
             <w:r>
               <w:rPr>
                 <w:rFonts w:ascii="Times New Roman" w:hAnsi="Times New Roman" w:eastAsia="Times New Roman"/>
-                <w:sz w:val="17"/>
+                <w:sz w:val="16"/>
               </w:rPr>
               <w:t xml:space="preserve">SiamUNet-diff</w:t>
             </w:r>
@@ -14228,7 +14228,7 @@
         </w:tc>
         <w:tc>
           <w:tcPr>
-            <w:tcW w:type="dxa" w:w="737"/>
+            <w:tcW w:type="dxa" w:w="680"/>
             <w:vAlign w:val="center"/>
           </w:tcPr>
           <w:p>
@@ -14240,7 +14240,7 @@
             <w:r>
               <w:rPr>
                 <w:rFonts w:ascii="Times New Roman" w:hAnsi="Times New Roman" w:eastAsia="Times New Roman"/>
-                <w:sz w:val="17"/>
+                <w:sz w:val="16"/>
               </w:rPr>
               <w:t xml:space="preserve">2.01M</w:t>
             </w:r>
@@ -14248,7 +14248,7 @@
         </w:tc>
         <w:tc>
           <w:tcPr>
-            <w:tcW w:type="dxa" w:w="1247"/>
+            <w:tcW w:type="dxa" w:w="1020"/>
             <w:vAlign w:val="center"/>
           </w:tcPr>
           <w:p>
@@ -14260,7 +14260,7 @@
             <w:r>
               <w:rPr>
                 <w:rFonts w:ascii="Times New Roman" w:hAnsi="Times New Roman" w:eastAsia="Times New Roman"/>
-                <w:sz w:val="17"/>
+                <w:sz w:val="16"/>
               </w:rPr>
               <w:t xml:space="preserve">72.64 ± 0.39</w:t>
             </w:r>
@@ -14280,7 +14280,7 @@
             <w:r>
               <w:rPr>
                 <w:rFonts w:ascii="Times New Roman" w:hAnsi="Times New Roman" w:eastAsia="Times New Roman"/>
-                <w:sz w:val="17"/>
+                <w:sz w:val="16"/>
               </w:rPr>
               <w:t xml:space="preserve">57.03 ± 0.48</w:t>
             </w:r>
@@ -14300,7 +14300,7 @@
             <w:r>
               <w:rPr>
                 <w:rFonts w:ascii="Times New Roman" w:hAnsi="Times New Roman" w:eastAsia="Times New Roman"/>
-                <w:sz w:val="17"/>
+                <w:sz w:val="16"/>
               </w:rPr>
               <w:t xml:space="preserve">63.25 ± 2.52</w:t>
             </w:r>
@@ -14308,7 +14308,7 @@
         </w:tc>
         <w:tc>
           <w:tcPr>
-            <w:tcW w:type="dxa" w:w="1247"/>
+            <w:tcW w:type="dxa" w:w="1020"/>
             <w:vAlign w:val="center"/>
           </w:tcPr>
           <w:p>
@@ -14320,7 +14320,7 @@
             <w:r>
               <w:rPr>
                 <w:rFonts w:ascii="Times New Roman" w:hAnsi="Times New Roman" w:eastAsia="Times New Roman"/>
-                <w:sz w:val="17"/>
+                <w:sz w:val="16"/>
               </w:rPr>
               <w:t xml:space="preserve">37.11 ± 2.44</w:t>
             </w:r>
@@ -14328,7 +14328,7 @@
         </w:tc>
         <w:tc>
           <w:tcPr>
-            <w:tcW w:type="dxa" w:w="907"/>
+            <w:tcW w:type="dxa" w:w="964"/>
             <w:vAlign w:val="center"/>
           </w:tcPr>
           <w:p>
@@ -14340,7 +14340,7 @@
             <w:r>
               <w:rPr>
                 <w:rFonts w:ascii="Times New Roman" w:hAnsi="Times New Roman" w:eastAsia="Times New Roman"/>
-                <w:sz w:val="17"/>
+                <w:sz w:val="16"/>
               </w:rPr>
               <w:t xml:space="preserve">22.81 ± 1.86</w:t>
             </w:r>
@@ -14348,7 +14348,7 @@
         </w:tc>
         <w:tc>
           <w:tcPr>
-            <w:tcW w:type="dxa" w:w="1020"/>
+            <w:tcW w:type="dxa" w:w="964"/>
             <w:vAlign w:val="center"/>
           </w:tcPr>
           <w:p>
@@ -14360,7 +14360,7 @@
             <w:r>
               <w:rPr>
                 <w:rFonts w:ascii="Times New Roman" w:hAnsi="Times New Roman" w:eastAsia="Times New Roman"/>
-                <w:sz w:val="17"/>
+                <w:sz w:val="16"/>
               </w:rPr>
               <w:t xml:space="preserve">54.87 ± 1.03</w:t>
             </w:r>
@@ -14373,7 +14373,7 @@
         </w:trPr>
         <w:tc>
           <w:tcPr>
-            <w:tcW w:type="dxa" w:w="1814"/>
+            <w:tcW w:type="dxa" w:w="2268"/>
             <w:vAlign w:val="center"/>
           </w:tcPr>
           <w:p>
@@ -14385,7 +14385,7 @@
             <w:r>
               <w:rPr>
                 <w:rFonts w:ascii="Times New Roman" w:hAnsi="Times New Roman" w:eastAsia="Times New Roman"/>
-                <w:sz w:val="17"/>
+                <w:sz w:val="16"/>
               </w:rPr>
               <w:t xml:space="preserve">SiamUNet-conc</w:t>
             </w:r>
@@ -14393,7 +14393,7 @@
         </w:tc>
         <w:tc>
           <w:tcPr>
-            <w:tcW w:type="dxa" w:w="737"/>
+            <w:tcW w:type="dxa" w:w="680"/>
             <w:vAlign w:val="center"/>
           </w:tcPr>
           <w:p>
@@ -14405,7 +14405,7 @@
             <w:r>
               <w:rPr>
                 <w:rFonts w:ascii="Times New Roman" w:hAnsi="Times New Roman" w:eastAsia="Times New Roman"/>
-                <w:sz w:val="17"/>
+                <w:sz w:val="16"/>
               </w:rPr>
               <w:t xml:space="preserve">2.36M</w:t>
             </w:r>
@@ -14413,7 +14413,7 @@
         </w:tc>
         <w:tc>
           <w:tcPr>
-            <w:tcW w:type="dxa" w:w="1247"/>
+            <w:tcW w:type="dxa" w:w="1020"/>
             <w:vAlign w:val="center"/>
           </w:tcPr>
           <w:p>
@@ -14425,7 +14425,7 @@
             <w:r>
               <w:rPr>
                 <w:rFonts w:ascii="Times New Roman" w:hAnsi="Times New Roman" w:eastAsia="Times New Roman"/>
-                <w:sz w:val="17"/>
+                <w:sz w:val="16"/>
               </w:rPr>
               <w:t xml:space="preserve">78.92 ± 1.07</w:t>
             </w:r>
@@ -14445,7 +14445,7 @@
             <w:r>
               <w:rPr>
                 <w:rFonts w:ascii="Times New Roman" w:hAnsi="Times New Roman" w:eastAsia="Times New Roman"/>
-                <w:sz w:val="17"/>
+                <w:sz w:val="16"/>
               </w:rPr>
               <w:t xml:space="preserve">65.20 ± 1.46</w:t>
             </w:r>
@@ -14465,7 +14465,7 @@
             <w:r>
               <w:rPr>
                 <w:rFonts w:ascii="Times New Roman" w:hAnsi="Times New Roman" w:eastAsia="Times New Roman"/>
-                <w:sz w:val="17"/>
+                <w:sz w:val="16"/>
               </w:rPr>
               <w:t xml:space="preserve">82.62 ± 1.07</w:t>
             </w:r>
@@ -14473,7 +14473,7 @@
         </w:tc>
         <w:tc>
           <w:tcPr>
-            <w:tcW w:type="dxa" w:w="1247"/>
+            <w:tcW w:type="dxa" w:w="1020"/>
             <w:vAlign w:val="center"/>
           </w:tcPr>
           <w:p>
@@ -14485,7 +14485,7 @@
             <w:r>
               <w:rPr>
                 <w:rFonts w:ascii="Times New Roman" w:hAnsi="Times New Roman" w:eastAsia="Times New Roman"/>
-                <w:sz w:val="17"/>
+                <w:sz w:val="16"/>
               </w:rPr>
               <w:t xml:space="preserve">47.34 ± 0.70</w:t>
             </w:r>
@@ -14493,7 +14493,7 @@
         </w:tc>
         <w:tc>
           <w:tcPr>
-            <w:tcW w:type="dxa" w:w="907"/>
+            <w:tcW w:type="dxa" w:w="964"/>
             <w:vAlign w:val="center"/>
           </w:tcPr>
           <w:p>
@@ -14505,7 +14505,7 @@
             <w:r>
               <w:rPr>
                 <w:rFonts w:ascii="Times New Roman" w:hAnsi="Times New Roman" w:eastAsia="Times New Roman"/>
-                <w:sz w:val="17"/>
+                <w:sz w:val="16"/>
               </w:rPr>
               <w:t xml:space="preserve">31.02 ± 0.60</w:t>
             </w:r>
@@ -14513,7 +14513,7 @@
         </w:tc>
         <w:tc>
           <w:tcPr>
-            <w:tcW w:type="dxa" w:w="1020"/>
+            <w:tcW w:type="dxa" w:w="964"/>
             <w:vAlign w:val="center"/>
           </w:tcPr>
           <w:p>
@@ -14525,7 +14525,7 @@
             <w:r>
               <w:rPr>
                 <w:rFonts w:ascii="Times New Roman" w:hAnsi="Times New Roman" w:eastAsia="Times New Roman"/>
-                <w:sz w:val="17"/>
+                <w:sz w:val="16"/>
               </w:rPr>
               <w:t xml:space="preserve">63.13 ± 0.79</w:t>
             </w:r>
@@ -14538,7 +14538,7 @@
         </w:trPr>
         <w:tc>
           <w:tcPr>
-            <w:tcW w:type="dxa" w:w="1814"/>
+            <w:tcW w:type="dxa" w:w="2268"/>
             <w:vAlign w:val="center"/>
           </w:tcPr>
           <w:p>
@@ -14550,7 +14550,7 @@
             <w:r>
               <w:rPr>
                 <w:rFonts w:ascii="Times New Roman" w:hAnsi="Times New Roman" w:eastAsia="Times New Roman"/>
-                <w:sz w:val="17"/>
+                <w:sz w:val="16"/>
               </w:rPr>
               <w:t xml:space="preserve">ResU-Net</w:t>
             </w:r>
@@ -14558,7 +14558,7 @@
         </w:tc>
         <w:tc>
           <w:tcPr>
-            <w:tcW w:type="dxa" w:w="737"/>
+            <w:tcW w:type="dxa" w:w="680"/>
             <w:vAlign w:val="center"/>
           </w:tcPr>
           <w:p>
@@ -14570,7 +14570,7 @@
             <w:r>
               <w:rPr>
                 <w:rFonts w:ascii="Times New Roman" w:hAnsi="Times New Roman" w:eastAsia="Times New Roman"/>
-                <w:sz w:val="17"/>
+                <w:sz w:val="16"/>
               </w:rPr>
               <w:t xml:space="preserve">2.01M</w:t>
             </w:r>
@@ -14578,7 +14578,7 @@
         </w:tc>
         <w:tc>
           <w:tcPr>
-            <w:tcW w:type="dxa" w:w="1247"/>
+            <w:tcW w:type="dxa" w:w="1020"/>
             <w:vAlign w:val="center"/>
           </w:tcPr>
           <w:p>
@@ -14590,7 +14590,7 @@
             <w:r>
               <w:rPr>
                 <w:rFonts w:ascii="Times New Roman" w:hAnsi="Times New Roman" w:eastAsia="Times New Roman"/>
-                <w:sz w:val="17"/>
+                <w:sz w:val="16"/>
               </w:rPr>
               <w:t xml:space="preserve">76.60 ± 1.30</w:t>
             </w:r>
@@ -14610,7 +14610,7 @@
             <w:r>
               <w:rPr>
                 <w:rFonts w:ascii="Times New Roman" w:hAnsi="Times New Roman" w:eastAsia="Times New Roman"/>
-                <w:sz w:val="17"/>
+                <w:sz w:val="16"/>
               </w:rPr>
               <w:t xml:space="preserve">62.09 ± 1.71</w:t>
             </w:r>
@@ -14630,7 +14630,7 @@
             <w:r>
               <w:rPr>
                 <w:rFonts w:ascii="Times New Roman" w:hAnsi="Times New Roman" w:eastAsia="Times New Roman"/>
-                <w:sz w:val="17"/>
+                <w:sz w:val="16"/>
               </w:rPr>
               <w:t xml:space="preserve">76.92 ± 4.83</w:t>
             </w:r>
@@ -14638,7 +14638,7 @@
         </w:tc>
         <w:tc>
           <w:tcPr>
-            <w:tcW w:type="dxa" w:w="1247"/>
+            <w:tcW w:type="dxa" w:w="1020"/>
             <w:vAlign w:val="center"/>
           </w:tcPr>
           <w:p>
@@ -14650,7 +14650,7 @@
             <w:r>
               <w:rPr>
                 <w:rFonts w:ascii="Times New Roman" w:hAnsi="Times New Roman" w:eastAsia="Times New Roman"/>
-                <w:sz w:val="17"/>
+                <w:sz w:val="16"/>
               </w:rPr>
               <w:t xml:space="preserve">49.25 ± 3.39</w:t>
             </w:r>
@@ -14658,7 +14658,7 @@
         </w:tc>
         <w:tc>
           <w:tcPr>
-            <w:tcW w:type="dxa" w:w="907"/>
+            <w:tcW w:type="dxa" w:w="964"/>
             <w:vAlign w:val="center"/>
           </w:tcPr>
           <w:p>
@@ -14670,7 +14670,7 @@
             <w:r>
               <w:rPr>
                 <w:rFonts w:ascii="Times New Roman" w:hAnsi="Times New Roman" w:eastAsia="Times New Roman"/>
-                <w:sz w:val="17"/>
+                <w:sz w:val="16"/>
               </w:rPr>
               <w:t xml:space="preserve">32.74 ± 2.96</w:t>
             </w:r>
@@ -14678,7 +14678,7 @@
         </w:tc>
         <w:tc>
           <w:tcPr>
-            <w:tcW w:type="dxa" w:w="1020"/>
+            <w:tcW w:type="dxa" w:w="964"/>
             <w:vAlign w:val="center"/>
           </w:tcPr>
           <w:p>
@@ -14690,7 +14690,7 @@
             <w:r>
               <w:rPr>
                 <w:rFonts w:ascii="Times New Roman" w:hAnsi="Times New Roman" w:eastAsia="Times New Roman"/>
-                <w:sz w:val="17"/>
+                <w:sz w:val="16"/>
               </w:rPr>
               <w:t xml:space="preserve">62.92 ± 1.42</w:t>
             </w:r>
@@ -14703,7 +14703,7 @@
         </w:trPr>
         <w:tc>
           <w:tcPr>
-            <w:tcW w:type="dxa" w:w="1814"/>
+            <w:tcW w:type="dxa" w:w="2268"/>
             <w:vAlign w:val="center"/>
           </w:tcPr>
           <w:p>
@@ -14715,7 +14715,7 @@
             <w:r>
               <w:rPr>
                 <w:rFonts w:ascii="Times New Roman" w:hAnsi="Times New Roman" w:eastAsia="Times New Roman"/>
-                <w:sz w:val="17"/>
+                <w:sz w:val="16"/>
               </w:rPr>
               <w:t xml:space="preserve">Attention U-Net</w:t>
             </w:r>
@@ -14723,7 +14723,7 @@
         </w:tc>
         <w:tc>
           <w:tcPr>
-            <w:tcW w:type="dxa" w:w="737"/>
+            <w:tcW w:type="dxa" w:w="680"/>
             <w:vAlign w:val="center"/>
           </w:tcPr>
           <w:p>
@@ -14735,7 +14735,7 @@
             <w:r>
               <w:rPr>
                 <w:rFonts w:ascii="Times New Roman" w:hAnsi="Times New Roman" w:eastAsia="Times New Roman"/>
-                <w:sz w:val="17"/>
+                <w:sz w:val="16"/>
               </w:rPr>
               <w:t xml:space="preserve">2.29M</w:t>
             </w:r>
@@ -14743,7 +14743,7 @@
         </w:tc>
         <w:tc>
           <w:tcPr>
-            <w:tcW w:type="dxa" w:w="1247"/>
+            <w:tcW w:type="dxa" w:w="1020"/>
             <w:vAlign w:val="center"/>
           </w:tcPr>
           <w:p>
@@ -14755,7 +14755,7 @@
             <w:r>
               <w:rPr>
                 <w:rFonts w:ascii="Times New Roman" w:hAnsi="Times New Roman" w:eastAsia="Times New Roman"/>
-                <w:sz w:val="17"/>
+                <w:sz w:val="16"/>
               </w:rPr>
               <w:t xml:space="preserve">78.09 ± 0.99</w:t>
             </w:r>
@@ -14775,7 +14775,7 @@
             <w:r>
               <w:rPr>
                 <w:rFonts w:ascii="Times New Roman" w:hAnsi="Times New Roman" w:eastAsia="Times New Roman"/>
-                <w:sz w:val="17"/>
+                <w:sz w:val="16"/>
               </w:rPr>
               <w:t xml:space="preserve">64.07 ± 1.33</w:t>
             </w:r>
@@ -14795,7 +14795,7 @@
             <w:r>
               <w:rPr>
                 <w:rFonts w:ascii="Times New Roman" w:hAnsi="Times New Roman" w:eastAsia="Times New Roman"/>
-                <w:sz w:val="17"/>
+                <w:sz w:val="16"/>
               </w:rPr>
               <w:t xml:space="preserve">79.20 ± 2.45</w:t>
             </w:r>
@@ -14803,7 +14803,7 @@
         </w:tc>
         <w:tc>
           <w:tcPr>
-            <w:tcW w:type="dxa" w:w="1247"/>
+            <w:tcW w:type="dxa" w:w="1020"/>
             <w:vAlign w:val="center"/>
           </w:tcPr>
           <w:p>
@@ -14815,7 +14815,7 @@
             <w:r>
               <w:rPr>
                 <w:rFonts w:ascii="Times New Roman" w:hAnsi="Times New Roman" w:eastAsia="Times New Roman"/>
-                <w:sz w:val="17"/>
+                <w:sz w:val="16"/>
               </w:rPr>
               <w:t xml:space="preserve">48.73 ± 2.74</w:t>
             </w:r>
@@ -14823,7 +14823,7 @@
         </w:tc>
         <w:tc>
           <w:tcPr>
-            <w:tcW w:type="dxa" w:w="907"/>
+            <w:tcW w:type="dxa" w:w="964"/>
             <w:vAlign w:val="center"/>
           </w:tcPr>
           <w:p>
@@ -14835,7 +14835,7 @@
             <w:r>
               <w:rPr>
                 <w:rFonts w:ascii="Times New Roman" w:hAnsi="Times New Roman" w:eastAsia="Times New Roman"/>
-                <w:sz w:val="17"/>
+                <w:sz w:val="16"/>
               </w:rPr>
               <w:t xml:space="preserve">32.26 ± 2.38</w:t>
             </w:r>
@@ -14843,7 +14843,7 @@
         </w:tc>
         <w:tc>
           <w:tcPr>
-            <w:tcW w:type="dxa" w:w="1020"/>
+            <w:tcW w:type="dxa" w:w="964"/>
             <w:vAlign w:val="center"/>
           </w:tcPr>
           <w:p>
@@ -14855,7 +14855,7 @@
             <w:r>
               <w:rPr>
                 <w:rFonts w:ascii="Times New Roman" w:hAnsi="Times New Roman" w:eastAsia="Times New Roman"/>
-                <w:sz w:val="17"/>
+                <w:sz w:val="16"/>
               </w:rPr>
               <w:t xml:space="preserve">63.41 ± 1.03</w:t>
             </w:r>
@@ -14868,7 +14868,7 @@
         </w:trPr>
         <w:tc>
           <w:tcPr>
-            <w:tcW w:type="dxa" w:w="1814"/>
+            <w:tcW w:type="dxa" w:w="2268"/>
             <w:vAlign w:val="center"/>
           </w:tcPr>
           <w:p>
@@ -14882,7 +14882,7 @@
                 <w:rFonts w:ascii="Times New Roman" w:hAnsi="Times New Roman" w:eastAsia="Times New Roman"/>
                 <w:b/>
                 <w:bCs/>
-                <w:sz w:val="17"/>
+                <w:sz w:val="16"/>
               </w:rPr>
               <w:t xml:space="preserve">TopoRadar-Net (Ours, S42)</w:t>
             </w:r>
@@ -14890,7 +14890,7 @@
         </w:tc>
         <w:tc>
           <w:tcPr>
-            <w:tcW w:type="dxa" w:w="737"/>
+            <w:tcW w:type="dxa" w:w="680"/>
             <w:vAlign w:val="center"/>
           </w:tcPr>
           <w:p>
@@ -14902,7 +14902,7 @@
             <w:r>
               <w:rPr>
                 <w:rFonts w:ascii="Times New Roman" w:hAnsi="Times New Roman" w:eastAsia="Times New Roman"/>
-                <w:sz w:val="17"/>
+                <w:sz w:val="16"/>
               </w:rPr>
               <w:t xml:space="preserve">3.46M</w:t>
             </w:r>
@@ -14910,7 +14910,7 @@
         </w:tc>
         <w:tc>
           <w:tcPr>
-            <w:tcW w:type="dxa" w:w="1247"/>
+            <w:tcW w:type="dxa" w:w="1020"/>
             <w:vAlign w:val="center"/>
           </w:tcPr>
           <w:p>
@@ -14922,7 +14922,7 @@
             <w:r>
               <w:rPr>
                 <w:rFonts w:ascii="Times New Roman" w:hAnsi="Times New Roman" w:eastAsia="Times New Roman"/>
-                <w:sz w:val="17"/>
+                <w:sz w:val="16"/>
               </w:rPr>
               <w:t xml:space="preserve">79.35</w:t>
             </w:r>
@@ -14942,7 +14942,7 @@
             <w:r>
               <w:rPr>
                 <w:rFonts w:ascii="Times New Roman" w:hAnsi="Times New Roman" w:eastAsia="Times New Roman"/>
-                <w:sz w:val="17"/>
+                <w:sz w:val="16"/>
               </w:rPr>
               <w:t xml:space="preserve">65.76</w:t>
             </w:r>
@@ -14962,7 +14962,7 @@
             <w:r>
               <w:rPr>
                 <w:rFonts w:ascii="Times New Roman" w:hAnsi="Times New Roman" w:eastAsia="Times New Roman"/>
-                <w:sz w:val="17"/>
+                <w:sz w:val="16"/>
               </w:rPr>
               <w:t xml:space="preserve">74.36</w:t>
             </w:r>
@@ -14970,7 +14970,7 @@
         </w:tc>
         <w:tc>
           <w:tcPr>
-            <w:tcW w:type="dxa" w:w="1247"/>
+            <w:tcW w:type="dxa" w:w="1020"/>
             <w:vAlign w:val="center"/>
           </w:tcPr>
           <w:p>
@@ -14982,7 +14982,7 @@
             <w:r>
               <w:rPr>
                 <w:rFonts w:ascii="Times New Roman" w:hAnsi="Times New Roman" w:eastAsia="Times New Roman"/>
-                <w:sz w:val="17"/>
+                <w:sz w:val="16"/>
               </w:rPr>
               <w:t xml:space="preserve">51.23</w:t>
             </w:r>
@@ -14990,7 +14990,7 @@
         </w:tc>
         <w:tc>
           <w:tcPr>
-            <w:tcW w:type="dxa" w:w="907"/>
+            <w:tcW w:type="dxa" w:w="964"/>
             <w:vAlign w:val="center"/>
           </w:tcPr>
           <w:p>
@@ -15002,7 +15002,7 @@
             <w:r>
               <w:rPr>
                 <w:rFonts w:ascii="Times New Roman" w:hAnsi="Times New Roman" w:eastAsia="Times New Roman"/>
-                <w:sz w:val="17"/>
+                <w:sz w:val="16"/>
               </w:rPr>
               <w:t xml:space="preserve">34.44</w:t>
             </w:r>
@@ -15010,7 +15010,7 @@
         </w:tc>
         <w:tc>
           <w:tcPr>
-            <w:tcW w:type="dxa" w:w="1020"/>
+            <w:tcW w:type="dxa" w:w="964"/>
             <w:vAlign w:val="center"/>
           </w:tcPr>
           <w:p>
@@ -15022,7 +15022,7 @@
             <w:r>
               <w:rPr>
                 <w:rFonts w:ascii="Times New Roman" w:hAnsi="Times New Roman" w:eastAsia="Times New Roman"/>
-                <w:sz w:val="17"/>
+                <w:sz w:val="16"/>
               </w:rPr>
               <w:t xml:space="preserve">65.29</w:t>
             </w:r>
@@ -15035,7 +15035,7 @@
         </w:trPr>
         <w:tc>
           <w:tcPr>
-            <w:tcW w:type="dxa" w:w="1814"/>
+            <w:tcW w:type="dxa" w:w="2268"/>
             <w:vAlign w:val="center"/>
           </w:tcPr>
           <w:p>
@@ -15049,7 +15049,7 @@
                 <w:rFonts w:ascii="Times New Roman" w:hAnsi="Times New Roman" w:eastAsia="Times New Roman"/>
                 <w:b/>
                 <w:bCs/>
-                <w:sz w:val="17"/>
+                <w:sz w:val="16"/>
               </w:rPr>
               <w:t xml:space="preserve">TopoRadar-Net (Ours, Mean)</w:t>
             </w:r>
@@ -15057,7 +15057,7 @@
         </w:tc>
         <w:tc>
           <w:tcPr>
-            <w:tcW w:type="dxa" w:w="737"/>
+            <w:tcW w:type="dxa" w:w="680"/>
             <w:vAlign w:val="center"/>
           </w:tcPr>
           <w:p>
@@ -15071,7 +15071,7 @@
                 <w:rFonts w:ascii="Times New Roman" w:hAnsi="Times New Roman" w:eastAsia="Times New Roman"/>
                 <w:b/>
                 <w:bCs/>
-                <w:sz w:val="17"/>
+                <w:sz w:val="16"/>
               </w:rPr>
               <w:t xml:space="preserve">3.46M</w:t>
             </w:r>
@@ -15079,7 +15079,7 @@
         </w:tc>
         <w:tc>
           <w:tcPr>
-            <w:tcW w:type="dxa" w:w="1247"/>
+            <w:tcW w:type="dxa" w:w="1020"/>
             <w:vAlign w:val="center"/>
           </w:tcPr>
           <w:p>
@@ -15093,7 +15093,7 @@
                 <w:rFonts w:ascii="Times New Roman" w:hAnsi="Times New Roman" w:eastAsia="Times New Roman"/>
                 <w:b/>
                 <w:bCs/>
-                <w:sz w:val="17"/>
+                <w:sz w:val="16"/>
               </w:rPr>
               <w:t xml:space="preserve">77.40 ± 1.86</w:t>
             </w:r>
@@ -15115,7 +15115,7 @@
                 <w:rFonts w:ascii="Times New Roman" w:hAnsi="Times New Roman" w:eastAsia="Times New Roman"/>
                 <w:b/>
                 <w:bCs/>
-                <w:sz w:val="17"/>
+                <w:sz w:val="16"/>
               </w:rPr>
               <w:t xml:space="preserve">63.16 ± 2.45</w:t>
             </w:r>
@@ -15137,7 +15137,7 @@
                 <w:rFonts w:ascii="Times New Roman" w:hAnsi="Times New Roman" w:eastAsia="Times New Roman"/>
                 <w:b/>
                 <w:bCs/>
-                <w:sz w:val="17"/>
+                <w:sz w:val="16"/>
               </w:rPr>
               <w:t xml:space="preserve">75.50 ± 1.61</w:t>
             </w:r>
@@ -15145,7 +15145,7 @@
         </w:tc>
         <w:tc>
           <w:tcPr>
-            <w:tcW w:type="dxa" w:w="1247"/>
+            <w:tcW w:type="dxa" w:w="1020"/>
             <w:vAlign w:val="center"/>
           </w:tcPr>
           <w:p>
@@ -15159,7 +15159,7 @@
                 <w:rFonts w:ascii="Times New Roman" w:hAnsi="Times New Roman" w:eastAsia="Times New Roman"/>
                 <w:b/>
                 <w:bCs/>
-                <w:sz w:val="17"/>
+                <w:sz w:val="16"/>
               </w:rPr>
               <w:t xml:space="preserve">50.18 ± 4.40</w:t>
             </w:r>
@@ -15167,7 +15167,7 @@
         </w:tc>
         <w:tc>
           <w:tcPr>
-            <w:tcW w:type="dxa" w:w="907"/>
+            <w:tcW w:type="dxa" w:w="964"/>
             <w:vAlign w:val="center"/>
           </w:tcPr>
           <w:p>
@@ -15181,7 +15181,7 @@
                 <w:rFonts w:ascii="Times New Roman" w:hAnsi="Times New Roman" w:eastAsia="Times New Roman"/>
                 <w:b/>
                 <w:bCs/>
-                <w:sz w:val="17"/>
+                <w:sz w:val="16"/>
               </w:rPr>
               <w:t xml:space="preserve">33.61 ± 3.89</w:t>
             </w:r>
@@ -15189,7 +15189,7 @@
         </w:tc>
         <w:tc>
           <w:tcPr>
-            <w:tcW w:type="dxa" w:w="1020"/>
+            <w:tcW w:type="dxa" w:w="964"/>
             <w:vAlign w:val="center"/>
           </w:tcPr>
           <w:p>
@@ -15203,7 +15203,7 @@
                 <w:rFonts w:ascii="Times New Roman" w:hAnsi="Times New Roman" w:eastAsia="Times New Roman"/>
                 <w:b/>
                 <w:bCs/>
-                <w:sz w:val="17"/>
+                <w:sz w:val="16"/>
               </w:rPr>
               <w:t xml:space="preserve">63.79 ± 1.88</w:t>
             </w:r>
@@ -15867,7 +15867,7 @@
         </w:rPr>
         <w:drawing>
           <wp:inline>
-            <wp:extent cx="5334000" cy="2639171"/>
+            <wp:extent cx="5334000" cy="3235236"/>
             <wp:effectExtent b="0" l="0" r="0" t="0"/>
             <wp:docPr descr="" title="" id="27" name="Picture"/>
             <a:graphic>
@@ -15888,7 +15888,7 @@
                   <pic:spPr bwMode="auto">
                     <a:xfrm>
                       <a:off x="0" y="0"/>
-                      <a:ext cx="5334000" cy="2639171"/>
+                      <a:ext cx="5334000" cy="3235236"/>
                     </a:xfrm>
                     <a:prstGeom prst="rect">
                       <a:avLst/>
@@ -18696,7 +18696,7 @@
           <w:rFonts w:ascii="Times New Roman" w:hAnsi="Times New Roman" w:eastAsia="Times New Roman"/>
           <w:sz w:val="20"/>
         </w:rPr>
-        <w:t xml:space="preserve">only because R003 and R008 use independent deterministic bootstrap streams over the same 339 blocks. The descriptive across-seed mean is</w:t>
+        <w:t xml:space="preserve">only because the primary and seed-repeated analyses use independent deterministic bootstrap streams over the same 339 blocks. The descriptive across-seed mean is</w:t>
       </w:r>
       <w:r>
         <w:rPr>
@@ -20886,7 +20886,7 @@
         </w:rPr>
         <w:drawing>
           <wp:inline>
-            <wp:extent cx="5334000" cy="2397120"/>
+            <wp:extent cx="5334000" cy="3118499"/>
             <wp:effectExtent b="0" l="0" r="0" t="0"/>
             <wp:docPr descr="" title="" id="32" name="Picture"/>
             <a:graphic>
@@ -20907,7 +20907,7 @@
                   <pic:spPr bwMode="auto">
                     <a:xfrm>
                       <a:off x="0" y="0"/>
-                      <a:ext cx="5334000" cy="2397120"/>
+                      <a:ext cx="5334000" cy="3118499"/>
                     </a:xfrm>
                     <a:prstGeom prst="rect">
                       <a:avLst/>
@@ -21388,13 +21388,13 @@
         <w:tblLook w:firstRow="0" w:lastRow="0" w:firstColumn="0" w:lastColumn="0" w:noHBand="0" w:noVBand="0" w:val="0000"/>
       </w:tblPr>
       <w:tblGrid>
-        <w:gridCol w:w="1131"/>
-        <w:gridCol w:w="1131"/>
-        <w:gridCol w:w="1131"/>
-        <w:gridCol w:w="1131"/>
-        <w:gridCol w:w="1131"/>
-        <w:gridCol w:w="1131"/>
-        <w:gridCol w:w="1131"/>
+        <w:gridCol w:w="2835"/>
+        <w:gridCol w:w="1020"/>
+        <w:gridCol w:w="1020"/>
+        <w:gridCol w:w="1020"/>
+        <w:gridCol w:w="1020"/>
+        <w:gridCol w:w="1020"/>
+        <w:gridCol w:w="1020"/>
       </w:tblGrid>
       <w:tr>
         <w:trPr>
@@ -21403,7 +21403,7 @@
         </w:trPr>
         <w:tc>
           <w:tcPr>
-            <w:tcW w:type="dxa" w:w="2154"/>
+            <w:tcW w:type="dxa" w:w="2835"/>
             <w:vMerge w:val="restart"/>
             <w:vAlign w:val="center"/>
           </w:tcPr>
@@ -21418,7 +21418,7 @@
                 <w:rFonts w:ascii="Times New Roman" w:hAnsi="Times New Roman" w:eastAsia="Times New Roman"/>
                 <w:b/>
                 <w:bCs/>
-                <w:sz w:val="17"/>
+                <w:sz w:val="16"/>
               </w:rPr>
               <w:t xml:space="preserve">Configuration</w:t>
             </w:r>
@@ -21441,7 +21441,7 @@
                 <w:rFonts w:ascii="Times New Roman" w:hAnsi="Times New Roman" w:eastAsia="Times New Roman"/>
                 <w:b/>
                 <w:bCs/>
-                <w:sz w:val="17"/>
+                <w:sz w:val="16"/>
               </w:rPr>
               <w:t xml:space="preserve">Scandinavian Arctic (Troms</w:t>
             </w:r>
@@ -21450,7 +21450,7 @@
                 <w:rFonts w:ascii="Times New Roman" w:hAnsi="Times New Roman" w:eastAsia="Times New Roman"/>
                 <w:b/>
                 <w:bCs/>
-                <w:sz w:val="17"/>
+                <w:sz w:val="16"/>
               </w:rPr>
               <w:t xml:space="preserve">ø</w:t>
             </w:r>
@@ -21459,7 +21459,7 @@
                 <w:rFonts w:ascii="Times New Roman" w:hAnsi="Times New Roman" w:eastAsia="Times New Roman"/>
                 <w:b/>
                 <w:bCs/>
-                <w:sz w:val="17"/>
+                <w:sz w:val="16"/>
               </w:rPr>
               <w:t xml:space="preserve">)</w:t>
             </w:r>
@@ -21482,7 +21482,7 @@
                 <w:rFonts w:ascii="Times New Roman" w:hAnsi="Times New Roman" w:eastAsia="Times New Roman"/>
                 <w:b/>
                 <w:bCs/>
-                <w:sz w:val="17"/>
+                <w:sz w:val="16"/>
               </w:rPr>
               <w:t xml:space="preserve">Pamir Mountains (Pish)</w:t>
             </w:r>
@@ -21504,7 +21504,7 @@
                 <w:rFonts w:ascii="Times New Roman" w:hAnsi="Times New Roman" w:eastAsia="Times New Roman"/>
                 <w:b/>
                 <w:bCs/>
-                <w:sz w:val="17"/>
+                <w:sz w:val="16"/>
               </w:rPr>
               <w:t xml:space="preserve">Pooled</w:t>
             </w:r>
@@ -21527,7 +21527,7 @@
         </w:tc>
         <w:tc>
           <w:tcPr>
-            <w:tcW w:type="dxa" w:w="1134"/>
+            <w:tcW w:type="dxa" w:w="1020"/>
             <w:vAlign w:val="center"/>
           </w:tcPr>
           <w:p>
@@ -21541,7 +21541,7 @@
                 <w:rFonts w:ascii="Times New Roman" w:hAnsi="Times New Roman" w:eastAsia="Times New Roman"/>
                 <w:b/>
                 <w:bCs/>
-                <w:sz w:val="17"/>
+                <w:sz w:val="16"/>
               </w:rPr>
               <w:t xml:space="preserve">F1 (%)</w:t>
             </w:r>
@@ -21563,7 +21563,7 @@
                 <w:rFonts w:ascii="Times New Roman" w:hAnsi="Times New Roman" w:eastAsia="Times New Roman"/>
                 <w:b/>
                 <w:bCs/>
-                <w:sz w:val="17"/>
+                <w:sz w:val="16"/>
               </w:rPr>
               <w:t xml:space="preserve">IoU (%)</w:t>
             </w:r>
@@ -21585,7 +21585,7 @@
                 <w:rFonts w:ascii="Times New Roman" w:hAnsi="Times New Roman" w:eastAsia="Times New Roman"/>
                 <w:b/>
                 <w:bCs/>
-                <w:sz w:val="17"/>
+                <w:sz w:val="16"/>
               </w:rPr>
               <w:t xml:space="preserve">Prec (%)</w:t>
             </w:r>
@@ -21593,7 +21593,7 @@
         </w:tc>
         <w:tc>
           <w:tcPr>
-            <w:tcW w:type="dxa" w:w="1247"/>
+            <w:tcW w:type="dxa" w:w="1020"/>
             <w:vAlign w:val="center"/>
           </w:tcPr>
           <w:p>
@@ -21607,7 +21607,7 @@
                 <w:rFonts w:ascii="Times New Roman" w:hAnsi="Times New Roman" w:eastAsia="Times New Roman"/>
                 <w:b/>
                 <w:bCs/>
-                <w:sz w:val="17"/>
+                <w:sz w:val="16"/>
               </w:rPr>
               <w:t xml:space="preserve">F1 (%)</w:t>
             </w:r>
@@ -21629,7 +21629,7 @@
                 <w:rFonts w:ascii="Times New Roman" w:hAnsi="Times New Roman" w:eastAsia="Times New Roman"/>
                 <w:b/>
                 <w:bCs/>
-                <w:sz w:val="17"/>
+                <w:sz w:val="16"/>
               </w:rPr>
               <w:t xml:space="preserve">IoU (%)</w:t>
             </w:r>
@@ -21651,7 +21651,7 @@
                 <w:rFonts w:ascii="Times New Roman" w:hAnsi="Times New Roman" w:eastAsia="Times New Roman"/>
                 <w:b/>
                 <w:bCs/>
-                <w:sz w:val="17"/>
+                <w:sz w:val="16"/>
               </w:rPr>
               <w:t xml:space="preserve">Macro F1 (%)</w:t>
             </w:r>
@@ -21664,7 +21664,7 @@
         </w:trPr>
         <w:tc>
           <w:tcPr>
-            <w:tcW w:type="dxa" w:w="2154"/>
+            <w:tcW w:type="dxa" w:w="2835"/>
             <w:vAlign w:val="center"/>
           </w:tcPr>
           <w:p>
@@ -21676,7 +21676,7 @@
             <w:r>
               <w:rPr>
                 <w:rFonts w:ascii="Times New Roman" w:hAnsi="Times New Roman" w:eastAsia="Times New Roman"/>
-                <w:sz w:val="17"/>
+                <w:sz w:val="16"/>
               </w:rPr>
               <w:t xml:space="preserve">Full TopoRadar-Net</w:t>
             </w:r>
@@ -21684,7 +21684,7 @@
         </w:tc>
         <w:tc>
           <w:tcPr>
-            <w:tcW w:type="dxa" w:w="1134"/>
+            <w:tcW w:type="dxa" w:w="1020"/>
             <w:vAlign w:val="center"/>
           </w:tcPr>
           <w:p>
@@ -21698,7 +21698,7 @@
                 <w:rFonts w:ascii="Times New Roman" w:hAnsi="Times New Roman" w:eastAsia="Times New Roman"/>
                 <w:b/>
                 <w:bCs/>
-                <w:sz w:val="17"/>
+                <w:sz w:val="16"/>
               </w:rPr>
               <w:t xml:space="preserve">77.40 ± 1.86</w:t>
             </w:r>
@@ -21720,7 +21720,7 @@
                 <w:rFonts w:ascii="Times New Roman" w:hAnsi="Times New Roman" w:eastAsia="Times New Roman"/>
                 <w:b/>
                 <w:bCs/>
-                <w:sz w:val="17"/>
+                <w:sz w:val="16"/>
               </w:rPr>
               <w:t xml:space="preserve">63.16 ± 2.45</w:t>
             </w:r>
@@ -21742,7 +21742,7 @@
                 <w:rFonts w:ascii="Times New Roman" w:hAnsi="Times New Roman" w:eastAsia="Times New Roman"/>
                 <w:b/>
                 <w:bCs/>
-                <w:sz w:val="17"/>
+                <w:sz w:val="16"/>
               </w:rPr>
               <w:t xml:space="preserve">75.48 ± 1.15</w:t>
             </w:r>
@@ -21750,7 +21750,7 @@
         </w:tc>
         <w:tc>
           <w:tcPr>
-            <w:tcW w:type="dxa" w:w="1247"/>
+            <w:tcW w:type="dxa" w:w="1020"/>
             <w:vAlign w:val="center"/>
           </w:tcPr>
           <w:p>
@@ -21762,7 +21762,7 @@
             <w:r>
               <w:rPr>
                 <w:rFonts w:ascii="Times New Roman" w:hAnsi="Times New Roman" w:eastAsia="Times New Roman"/>
-                <w:sz w:val="17"/>
+                <w:sz w:val="16"/>
               </w:rPr>
               <w:t xml:space="preserve">50.18 ± 4.40</w:t>
             </w:r>
@@ -21782,7 +21782,7 @@
             <w:r>
               <w:rPr>
                 <w:rFonts w:ascii="Times New Roman" w:hAnsi="Times New Roman" w:eastAsia="Times New Roman"/>
-                <w:sz w:val="17"/>
+                <w:sz w:val="16"/>
               </w:rPr>
               <w:t xml:space="preserve">33.61 ± 3.89</w:t>
             </w:r>
@@ -21802,7 +21802,7 @@
             <w:r>
               <w:rPr>
                 <w:rFonts w:ascii="Times New Roman" w:hAnsi="Times New Roman" w:eastAsia="Times New Roman"/>
-                <w:sz w:val="17"/>
+                <w:sz w:val="16"/>
               </w:rPr>
               <w:t xml:space="preserve">63.79 ± 1.88</w:t>
             </w:r>
@@ -21815,7 +21815,7 @@
         </w:trPr>
         <w:tc>
           <w:tcPr>
-            <w:tcW w:type="dxa" w:w="2154"/>
+            <w:tcW w:type="dxa" w:w="2835"/>
             <w:vAlign w:val="center"/>
           </w:tcPr>
           <w:p>
@@ -21827,7 +21827,7 @@
             <w:r>
               <w:rPr>
                 <w:rFonts w:ascii="Times New Roman" w:hAnsi="Times New Roman" w:eastAsia="Times New Roman"/>
-                <w:sz w:val="17"/>
+                <w:sz w:val="16"/>
               </w:rPr>
               <w:t xml:space="preserve">w/o Local Incidence Angle (No-LIA)</w:t>
             </w:r>
@@ -21835,7 +21835,7 @@
         </w:tc>
         <w:tc>
           <w:tcPr>
-            <w:tcW w:type="dxa" w:w="1134"/>
+            <w:tcW w:type="dxa" w:w="1020"/>
             <w:vAlign w:val="center"/>
           </w:tcPr>
           <w:p>
@@ -21847,7 +21847,7 @@
             <w:r>
               <w:rPr>
                 <w:rFonts w:ascii="Times New Roman" w:hAnsi="Times New Roman" w:eastAsia="Times New Roman"/>
-                <w:sz w:val="17"/>
+                <w:sz w:val="16"/>
               </w:rPr>
               <w:t xml:space="preserve">75.67 ± 1.76</w:t>
             </w:r>
@@ -21867,7 +21867,7 @@
             <w:r>
               <w:rPr>
                 <w:rFonts w:ascii="Times New Roman" w:hAnsi="Times New Roman" w:eastAsia="Times New Roman"/>
-                <w:sz w:val="17"/>
+                <w:sz w:val="16"/>
               </w:rPr>
               <w:t xml:space="preserve">60.89 ± 2.26</w:t>
             </w:r>
@@ -21887,7 +21887,7 @@
             <w:r>
               <w:rPr>
                 <w:rFonts w:ascii="Times New Roman" w:hAnsi="Times New Roman" w:eastAsia="Times New Roman"/>
-                <w:sz w:val="17"/>
+                <w:sz w:val="16"/>
               </w:rPr>
               <w:t xml:space="preserve">71.02 ± 2.80</w:t>
             </w:r>
@@ -21895,7 +21895,7 @@
         </w:tc>
         <w:tc>
           <w:tcPr>
-            <w:tcW w:type="dxa" w:w="1247"/>
+            <w:tcW w:type="dxa" w:w="1020"/>
             <w:vAlign w:val="center"/>
           </w:tcPr>
           <w:p>
@@ -21907,7 +21907,7 @@
             <w:r>
               <w:rPr>
                 <w:rFonts w:ascii="Times New Roman" w:hAnsi="Times New Roman" w:eastAsia="Times New Roman"/>
-                <w:sz w:val="17"/>
+                <w:sz w:val="16"/>
               </w:rPr>
               <w:t xml:space="preserve">52.13 ± 1.11</w:t>
             </w:r>
@@ -21927,7 +21927,7 @@
             <w:r>
               <w:rPr>
                 <w:rFonts w:ascii="Times New Roman" w:hAnsi="Times New Roman" w:eastAsia="Times New Roman"/>
-                <w:sz w:val="17"/>
+                <w:sz w:val="16"/>
               </w:rPr>
               <w:t xml:space="preserve">35.26 ± 1.01</w:t>
             </w:r>
@@ -21947,7 +21947,7 @@
             <w:r>
               <w:rPr>
                 <w:rFonts w:ascii="Times New Roman" w:hAnsi="Times New Roman" w:eastAsia="Times New Roman"/>
-                <w:sz w:val="17"/>
+                <w:sz w:val="16"/>
               </w:rPr>
               <w:t xml:space="preserve">63.90 ± 1.37</w:t>
             </w:r>
@@ -21960,7 +21960,7 @@
         </w:trPr>
         <w:tc>
           <w:tcPr>
-            <w:tcW w:type="dxa" w:w="2154"/>
+            <w:tcW w:type="dxa" w:w="2835"/>
             <w:vAlign w:val="center"/>
           </w:tcPr>
           <w:p>
@@ -21972,7 +21972,7 @@
             <w:r>
               <w:rPr>
                 <w:rFonts w:ascii="Times New Roman" w:hAnsi="Times New Roman" w:eastAsia="Times New Roman"/>
-                <w:sz w:val="17"/>
+                <w:sz w:val="16"/>
               </w:rPr>
               <w:t xml:space="preserve">w/o Cross-Attention (No-CrossAttn)</w:t>
             </w:r>
@@ -21980,7 +21980,7 @@
         </w:tc>
         <w:tc>
           <w:tcPr>
-            <w:tcW w:type="dxa" w:w="1134"/>
+            <w:tcW w:type="dxa" w:w="1020"/>
             <w:vAlign w:val="center"/>
           </w:tcPr>
           <w:p>
@@ -21992,7 +21992,7 @@
             <w:r>
               <w:rPr>
                 <w:rFonts w:ascii="Times New Roman" w:hAnsi="Times New Roman" w:eastAsia="Times New Roman"/>
-                <w:sz w:val="17"/>
+                <w:sz w:val="16"/>
               </w:rPr>
               <w:t xml:space="preserve">76.85 ± 0.80</w:t>
             </w:r>
@@ -22012,7 +22012,7 @@
             <w:r>
               <w:rPr>
                 <w:rFonts w:ascii="Times New Roman" w:hAnsi="Times New Roman" w:eastAsia="Times New Roman"/>
-                <w:sz w:val="17"/>
+                <w:sz w:val="16"/>
               </w:rPr>
               <w:t xml:space="preserve">62.41 ± 1.06</w:t>
             </w:r>
@@ -22032,7 +22032,7 @@
             <w:r>
               <w:rPr>
                 <w:rFonts w:ascii="Times New Roman" w:hAnsi="Times New Roman" w:eastAsia="Times New Roman"/>
-                <w:sz w:val="17"/>
+                <w:sz w:val="16"/>
               </w:rPr>
               <w:t xml:space="preserve">70.77 ± 2.20</w:t>
             </w:r>
@@ -22040,7 +22040,7 @@
         </w:tc>
         <w:tc>
           <w:tcPr>
-            <w:tcW w:type="dxa" w:w="1247"/>
+            <w:tcW w:type="dxa" w:w="1020"/>
             <w:vAlign w:val="center"/>
           </w:tcPr>
           <w:p>
@@ -22052,7 +22052,7 @@
             <w:r>
               <w:rPr>
                 <w:rFonts w:ascii="Times New Roman" w:hAnsi="Times New Roman" w:eastAsia="Times New Roman"/>
-                <w:sz w:val="17"/>
+                <w:sz w:val="16"/>
               </w:rPr>
               <w:t xml:space="preserve">53.30 ± 0.93</w:t>
             </w:r>
@@ -22072,7 +22072,7 @@
             <w:r>
               <w:rPr>
                 <w:rFonts w:ascii="Times New Roman" w:hAnsi="Times New Roman" w:eastAsia="Times New Roman"/>
-                <w:sz w:val="17"/>
+                <w:sz w:val="16"/>
               </w:rPr>
               <w:t xml:space="preserve">36.34 ± 0.87</w:t>
             </w:r>
@@ -22092,7 +22092,7 @@
             <w:r>
               <w:rPr>
                 <w:rFonts w:ascii="Times New Roman" w:hAnsi="Times New Roman" w:eastAsia="Times New Roman"/>
-                <w:sz w:val="17"/>
+                <w:sz w:val="16"/>
               </w:rPr>
               <w:t xml:space="preserve">65.07 ± 0.53</w:t>
             </w:r>
@@ -22105,7 +22105,7 @@
         </w:trPr>
         <w:tc>
           <w:tcPr>
-            <w:tcW w:type="dxa" w:w="2154"/>
+            <w:tcW w:type="dxa" w:w="2835"/>
             <w:vAlign w:val="center"/>
           </w:tcPr>
           <w:p>
@@ -22117,7 +22117,7 @@
             <w:r>
               <w:rPr>
                 <w:rFonts w:ascii="Times New Roman" w:hAnsi="Times New Roman" w:eastAsia="Times New Roman"/>
-                <w:sz w:val="17"/>
+                <w:sz w:val="16"/>
               </w:rPr>
               <w:t xml:space="preserve">w/o Geomorphic Loss (No-GeoLoss)</w:t>
             </w:r>
@@ -22125,7 +22125,7 @@
         </w:tc>
         <w:tc>
           <w:tcPr>
-            <w:tcW w:type="dxa" w:w="1134"/>
+            <w:tcW w:type="dxa" w:w="1020"/>
             <w:vAlign w:val="center"/>
           </w:tcPr>
           <w:p>
@@ -22137,7 +22137,7 @@
             <w:r>
               <w:rPr>
                 <w:rFonts w:ascii="Times New Roman" w:hAnsi="Times New Roman" w:eastAsia="Times New Roman"/>
-                <w:sz w:val="17"/>
+                <w:sz w:val="16"/>
               </w:rPr>
               <w:t xml:space="preserve">76.70 ± 0.91</w:t>
             </w:r>
@@ -22157,7 +22157,7 @@
             <w:r>
               <w:rPr>
                 <w:rFonts w:ascii="Times New Roman" w:hAnsi="Times New Roman" w:eastAsia="Times New Roman"/>
-                <w:sz w:val="17"/>
+                <w:sz w:val="16"/>
               </w:rPr>
               <w:t xml:space="preserve">62.22 ± 1.20</w:t>
             </w:r>
@@ -22177,7 +22177,7 @@
             <w:r>
               <w:rPr>
                 <w:rFonts w:ascii="Times New Roman" w:hAnsi="Times New Roman" w:eastAsia="Times New Roman"/>
-                <w:sz w:val="17"/>
+                <w:sz w:val="16"/>
               </w:rPr>
               <w:t xml:space="preserve">72.50 ± 2.15</w:t>
             </w:r>
@@ -22185,7 +22185,7 @@
         </w:tc>
         <w:tc>
           <w:tcPr>
-            <w:tcW w:type="dxa" w:w="1247"/>
+            <w:tcW w:type="dxa" w:w="1020"/>
             <w:vAlign w:val="center"/>
           </w:tcPr>
           <w:p>
@@ -22197,7 +22197,7 @@
             <w:r>
               <w:rPr>
                 <w:rFonts w:ascii="Times New Roman" w:hAnsi="Times New Roman" w:eastAsia="Times New Roman"/>
-                <w:sz w:val="17"/>
+                <w:sz w:val="16"/>
               </w:rPr>
               <w:t xml:space="preserve">51.99 ± 1.31</w:t>
             </w:r>
@@ -22217,7 +22217,7 @@
             <w:r>
               <w:rPr>
                 <w:rFonts w:ascii="Times New Roman" w:hAnsi="Times New Roman" w:eastAsia="Times New Roman"/>
-                <w:sz w:val="17"/>
+                <w:sz w:val="16"/>
               </w:rPr>
               <w:t xml:space="preserve">35.14 ± 1.20</w:t>
             </w:r>
@@ -22237,7 +22237,7 @@
             <w:r>
               <w:rPr>
                 <w:rFonts w:ascii="Times New Roman" w:hAnsi="Times New Roman" w:eastAsia="Times New Roman"/>
-                <w:sz w:val="17"/>
+                <w:sz w:val="16"/>
               </w:rPr>
               <w:t xml:space="preserve">64.35 ± 1.05</w:t>
             </w:r>
@@ -22250,7 +22250,7 @@
         </w:trPr>
         <w:tc>
           <w:tcPr>
-            <w:tcW w:type="dxa" w:w="2154"/>
+            <w:tcW w:type="dxa" w:w="2835"/>
             <w:vAlign w:val="center"/>
           </w:tcPr>
           <w:p>
@@ -22262,7 +22262,7 @@
             <w:r>
               <w:rPr>
                 <w:rFonts w:ascii="Times New Roman" w:hAnsi="Times New Roman" w:eastAsia="Times New Roman"/>
-                <w:sz w:val="17"/>
+                <w:sz w:val="16"/>
               </w:rPr>
               <w:t xml:space="preserve">w/o Aspect Alignment (No-Aspect)</w:t>
             </w:r>
@@ -22270,7 +22270,7 @@
         </w:tc>
         <w:tc>
           <w:tcPr>
-            <w:tcW w:type="dxa" w:w="1134"/>
+            <w:tcW w:type="dxa" w:w="1020"/>
             <w:vAlign w:val="center"/>
           </w:tcPr>
           <w:p>
@@ -22282,7 +22282,7 @@
             <w:r>
               <w:rPr>
                 <w:rFonts w:ascii="Times New Roman" w:hAnsi="Times New Roman" w:eastAsia="Times New Roman"/>
-                <w:sz w:val="17"/>
+                <w:sz w:val="16"/>
               </w:rPr>
               <w:t xml:space="preserve">77.38 ± 2.66</w:t>
             </w:r>
@@ -22302,7 +22302,7 @@
             <w:r>
               <w:rPr>
                 <w:rFonts w:ascii="Times New Roman" w:hAnsi="Times New Roman" w:eastAsia="Times New Roman"/>
-                <w:sz w:val="17"/>
+                <w:sz w:val="16"/>
               </w:rPr>
               <w:t xml:space="preserve">63.18 ± 3.49</w:t>
             </w:r>
@@ -22322,7 +22322,7 @@
             <w:r>
               <w:rPr>
                 <w:rFonts w:ascii="Times New Roman" w:hAnsi="Times New Roman" w:eastAsia="Times New Roman"/>
-                <w:sz w:val="17"/>
+                <w:sz w:val="16"/>
               </w:rPr>
               <w:t xml:space="preserve">71.19 ± 3.40</w:t>
             </w:r>
@@ -22330,7 +22330,7 @@
         </w:tc>
         <w:tc>
           <w:tcPr>
-            <w:tcW w:type="dxa" w:w="1247"/>
+            <w:tcW w:type="dxa" w:w="1020"/>
             <w:vAlign w:val="center"/>
           </w:tcPr>
           <w:p>
@@ -22344,7 +22344,7 @@
                 <w:rFonts w:ascii="Times New Roman" w:hAnsi="Times New Roman" w:eastAsia="Times New Roman"/>
                 <w:b/>
                 <w:bCs/>
-                <w:sz w:val="17"/>
+                <w:sz w:val="16"/>
               </w:rPr>
               <w:t xml:space="preserve">53.32 ± 0.42</w:t>
             </w:r>
@@ -22366,7 +22366,7 @@
                 <w:rFonts w:ascii="Times New Roman" w:hAnsi="Times New Roman" w:eastAsia="Times New Roman"/>
                 <w:b/>
                 <w:bCs/>
-                <w:sz w:val="17"/>
+                <w:sz w:val="16"/>
               </w:rPr>
               <w:t xml:space="preserve">36.35 ± 0.39</w:t>
             </w:r>
@@ -22388,7 +22388,7 @@
                 <w:rFonts w:ascii="Times New Roman" w:hAnsi="Times New Roman" w:eastAsia="Times New Roman"/>
                 <w:b/>
                 <w:bCs/>
-                <w:sz w:val="17"/>
+                <w:sz w:val="16"/>
               </w:rPr>
               <w:t xml:space="preserve">65.35 ± 1.54</w:t>
             </w:r>
@@ -23517,7 +23517,7 @@
         </w:rPr>
         <w:drawing>
           <wp:inline>
-            <wp:extent cx="5334000" cy="2960841"/>
+            <wp:extent cx="5334000" cy="3120873"/>
             <wp:effectExtent b="0" l="0" r="0" t="0"/>
             <wp:docPr descr="" title="" id="36" name="Picture"/>
             <a:graphic>
@@ -23538,7 +23538,7 @@
                   <pic:spPr bwMode="auto">
                     <a:xfrm>
                       <a:off x="0" y="0"/>
-                      <a:ext cx="5334000" cy="2960841"/>
+                      <a:ext cx="5334000" cy="3120873"/>
                     </a:xfrm>
                     <a:prstGeom prst="rect">
                       <a:avLst/>
@@ -23940,14 +23940,14 @@
         <w:tblLook w:firstRow="0" w:lastRow="0" w:firstColumn="0" w:lastColumn="0" w:noHBand="0" w:noVBand="0" w:val="0000"/>
       </w:tblPr>
       <w:tblGrid>
-        <w:gridCol w:w="990"/>
-        <w:gridCol w:w="990"/>
-        <w:gridCol w:w="990"/>
-        <w:gridCol w:w="990"/>
-        <w:gridCol w:w="990"/>
-        <w:gridCol w:w="990"/>
-        <w:gridCol w:w="990"/>
-        <w:gridCol w:w="990"/>
+        <w:gridCol w:w="850"/>
+        <w:gridCol w:w="2551"/>
+        <w:gridCol w:w="794"/>
+        <w:gridCol w:w="964"/>
+        <w:gridCol w:w="964"/>
+        <w:gridCol w:w="964"/>
+        <w:gridCol w:w="964"/>
+        <w:gridCol w:w="964"/>
       </w:tblGrid>
       <w:tr>
         <w:trPr>
@@ -23956,6 +23956,121 @@
         </w:trPr>
         <w:tc>
           <w:tcPr>
+            <w:tcW w:type="dxa" w:w="850"/>
+            <w:vMerge w:val="restart"/>
+            <w:vAlign w:val="center"/>
+          </w:tcPr>
+          <w:p>
+            <w:pPr>
+              <w:pStyle w:val="Compact"/>
+              <w:spacing w:before="0" w:after="0" w:line="240" w:lineRule="auto"/>
+              <w:jc w:val="left"/>
+            </w:pPr>
+            <w:r>
+              <w:rPr>
+                <w:rFonts w:ascii="Times New Roman" w:hAnsi="Times New Roman" w:eastAsia="Times New Roman"/>
+                <w:b/>
+                <w:bCs/>
+                <w:sz w:val="16"/>
+              </w:rPr>
+              <w:t xml:space="preserve">Region</w:t>
+            </w:r>
+          </w:p>
+        </w:tc>
+        <w:tc>
+          <w:tcPr>
+            <w:tcW w:type="dxa" w:w="2551"/>
+            <w:vMerge w:val="restart"/>
+            <w:vAlign w:val="center"/>
+          </w:tcPr>
+          <w:p>
+            <w:pPr>
+              <w:pStyle w:val="Compact"/>
+              <w:spacing w:before="0" w:after="0" w:line="240" w:lineRule="auto"/>
+              <w:jc w:val="left"/>
+            </w:pPr>
+            <w:r>
+              <w:rPr>
+                <w:rFonts w:ascii="Times New Roman" w:hAnsi="Times New Roman" w:eastAsia="Times New Roman"/>
+                <w:b/>
+                <w:bCs/>
+                <w:sz w:val="16"/>
+              </w:rPr>
+              <w:t xml:space="preserve">Topographic Stratum</w:t>
+            </w:r>
+          </w:p>
+        </w:tc>
+        <w:tc>
+          <w:tcPr>
+            <w:tcW w:type="dxa" w:w="794"/>
+            <w:vMerge w:val="restart"/>
+            <w:vAlign w:val="center"/>
+          </w:tcPr>
+          <w:p>
+            <w:pPr>
+              <w:pStyle w:val="Compact"/>
+              <w:spacing w:before="0" w:after="0" w:line="240" w:lineRule="auto"/>
+              <w:jc w:val="center"/>
+            </w:pPr>
+            <w:r>
+              <w:rPr>
+                <w:rFonts w:ascii="Times New Roman" w:hAnsi="Times New Roman" w:eastAsia="Times New Roman"/>
+                <w:b/>
+                <w:bCs/>
+                <w:sz w:val="16"/>
+              </w:rPr>
+              <w:t xml:space="preserve">Area (px)</w:t>
+            </w:r>
+          </w:p>
+        </w:tc>
+        <w:tc>
+          <w:tcPr>
+            <w:tcW w:type="dxa" w:w="964"/>
+            <w:gridSpan w:val="2"/>
+            <w:vAlign w:val="center"/>
+          </w:tcPr>
+          <w:p>
+            <w:pPr>
+              <w:pStyle w:val="Compact"/>
+              <w:spacing w:before="0" w:after="0" w:line="240" w:lineRule="auto"/>
+              <w:jc w:val="center"/>
+            </w:pPr>
+            <w:r>
+              <w:rPr>
+                <w:rFonts w:ascii="Times New Roman" w:hAnsi="Times New Roman" w:eastAsia="Times New Roman"/>
+                <w:b/>
+                <w:bCs/>
+                <w:sz w:val="16"/>
+              </w:rPr>
+              <w:t xml:space="preserve">TopoRadar (Ours)</w:t>
+            </w:r>
+          </w:p>
+        </w:tc>
+        <w:tc>
+          <w:tcPr>
+            <w:tcW w:type="dxa" w:w="964"/>
+            <w:gridSpan w:val="2"/>
+            <w:vAlign w:val="center"/>
+          </w:tcPr>
+          <w:p>
+            <w:pPr>
+              <w:pStyle w:val="Compact"/>
+              <w:spacing w:before="0" w:after="0" w:line="240" w:lineRule="auto"/>
+              <w:jc w:val="center"/>
+            </w:pPr>
+            <w:r>
+              <w:rPr>
+                <w:rFonts w:ascii="Times New Roman" w:hAnsi="Times New Roman" w:eastAsia="Times New Roman"/>
+                <w:b/>
+                <w:bCs/>
+                <w:sz w:val="16"/>
+              </w:rPr>
+              <w:t xml:space="preserve">Attention U-Net</w:t>
+            </w:r>
+          </w:p>
+        </w:tc>
+        <w:tc>
+          <w:tcPr>
             <w:tcW w:type="dxa" w:w="964"/>
             <w:vMerge w:val="restart"/>
             <w:vAlign w:val="center"/>
@@ -23964,129 +24079,14 @@
             <w:pPr>
               <w:pStyle w:val="Compact"/>
               <w:spacing w:before="0" w:after="0" w:line="240" w:lineRule="auto"/>
-              <w:jc w:val="left"/>
+              <w:jc w:val="center"/>
             </w:pPr>
             <w:r>
               <w:rPr>
                 <w:rFonts w:ascii="Times New Roman" w:hAnsi="Times New Roman" w:eastAsia="Times New Roman"/>
                 <w:b/>
                 <w:bCs/>
-                <w:sz w:val="17"/>
-              </w:rPr>
-              <w:t xml:space="preserve">Region</w:t>
-            </w:r>
-          </w:p>
-        </w:tc>
-        <w:tc>
-          <w:tcPr>
-            <w:tcW w:type="dxa" w:w="2551"/>
-            <w:vMerge w:val="restart"/>
-            <w:vAlign w:val="center"/>
-          </w:tcPr>
-          <w:p>
-            <w:pPr>
-              <w:pStyle w:val="Compact"/>
-              <w:spacing w:before="0" w:after="0" w:line="240" w:lineRule="auto"/>
-              <w:jc w:val="left"/>
-            </w:pPr>
-            <w:r>
-              <w:rPr>
-                <w:rFonts w:ascii="Times New Roman" w:hAnsi="Times New Roman" w:eastAsia="Times New Roman"/>
-                <w:b/>
-                <w:bCs/>
-                <w:sz w:val="17"/>
-              </w:rPr>
-              <w:t xml:space="preserve">Topographic Stratum</w:t>
-            </w:r>
-          </w:p>
-        </w:tc>
-        <w:tc>
-          <w:tcPr>
-            <w:tcW w:type="dxa" w:w="850"/>
-            <w:vMerge w:val="restart"/>
-            <w:vAlign w:val="center"/>
-          </w:tcPr>
-          <w:p>
-            <w:pPr>
-              <w:pStyle w:val="Compact"/>
-              <w:spacing w:before="0" w:after="0" w:line="240" w:lineRule="auto"/>
-              <w:jc w:val="center"/>
-            </w:pPr>
-            <w:r>
-              <w:rPr>
-                <w:rFonts w:ascii="Times New Roman" w:hAnsi="Times New Roman" w:eastAsia="Times New Roman"/>
-                <w:b/>
-                <w:bCs/>
-                <w:sz w:val="17"/>
-              </w:rPr>
-              <w:t xml:space="preserve">Area (px)</w:t>
-            </w:r>
-          </w:p>
-        </w:tc>
-        <w:tc>
-          <w:tcPr>
-            <w:tcW w:type="dxa" w:w="907"/>
-            <w:gridSpan w:val="2"/>
-            <w:vAlign w:val="center"/>
-          </w:tcPr>
-          <w:p>
-            <w:pPr>
-              <w:pStyle w:val="Compact"/>
-              <w:spacing w:before="0" w:after="0" w:line="240" w:lineRule="auto"/>
-              <w:jc w:val="center"/>
-            </w:pPr>
-            <w:r>
-              <w:rPr>
-                <w:rFonts w:ascii="Times New Roman" w:hAnsi="Times New Roman" w:eastAsia="Times New Roman"/>
-                <w:b/>
-                <w:bCs/>
-                <w:sz w:val="17"/>
-              </w:rPr>
-              <w:t xml:space="preserve">TopoRadar (Ours)</w:t>
-            </w:r>
-          </w:p>
-        </w:tc>
-        <w:tc>
-          <w:tcPr>
-            <w:tcW w:type="dxa" w:w="907"/>
-            <w:gridSpan w:val="2"/>
-            <w:vAlign w:val="center"/>
-          </w:tcPr>
-          <w:p>
-            <w:pPr>
-              <w:pStyle w:val="Compact"/>
-              <w:spacing w:before="0" w:after="0" w:line="240" w:lineRule="auto"/>
-              <w:jc w:val="center"/>
-            </w:pPr>
-            <w:r>
-              <w:rPr>
-                <w:rFonts w:ascii="Times New Roman" w:hAnsi="Times New Roman" w:eastAsia="Times New Roman"/>
-                <w:b/>
-                <w:bCs/>
-                <w:sz w:val="17"/>
-              </w:rPr>
-              <w:t xml:space="preserve">Attention U-Net</w:t>
-            </w:r>
-          </w:p>
-        </w:tc>
-        <w:tc>
-          <w:tcPr>
-            <w:tcW w:type="dxa" w:w="794"/>
-            <w:vMerge w:val="restart"/>
-            <w:vAlign w:val="center"/>
-          </w:tcPr>
-          <w:p>
-            <w:pPr>
-              <w:pStyle w:val="Compact"/>
-              <w:spacing w:before="0" w:after="0" w:line="240" w:lineRule="auto"/>
-              <w:jc w:val="center"/>
-            </w:pPr>
-            <w:r>
-              <w:rPr>
-                <w:rFonts w:ascii="Times New Roman" w:hAnsi="Times New Roman" w:eastAsia="Times New Roman"/>
-                <w:b/>
-                <w:bCs/>
-                <w:sz w:val="17"/>
+                <w:sz w:val="16"/>
               </w:rPr>
               <w:t xml:space="preserve">ΔF1</w:t>
             </w:r>
@@ -24127,7 +24127,7 @@
         </w:tc>
         <w:tc>
           <w:tcPr>
-            <w:tcW w:type="dxa" w:w="907"/>
+            <w:tcW w:type="dxa" w:w="964"/>
             <w:vAlign w:val="center"/>
           </w:tcPr>
           <w:p>
@@ -24141,7 +24141,7 @@
                 <w:rFonts w:ascii="Times New Roman" w:hAnsi="Times New Roman" w:eastAsia="Times New Roman"/>
                 <w:b/>
                 <w:bCs/>
-                <w:sz w:val="17"/>
+                <w:sz w:val="16"/>
               </w:rPr>
               <w:t xml:space="preserve">F1 (%)</w:t>
             </w:r>
@@ -24149,7 +24149,7 @@
         </w:tc>
         <w:tc>
           <w:tcPr>
-            <w:tcW w:type="dxa" w:w="907"/>
+            <w:tcW w:type="dxa" w:w="964"/>
             <w:vAlign w:val="center"/>
           </w:tcPr>
           <w:p>
@@ -24163,7 +24163,7 @@
                 <w:rFonts w:ascii="Times New Roman" w:hAnsi="Times New Roman" w:eastAsia="Times New Roman"/>
                 <w:b/>
                 <w:bCs/>
-                <w:sz w:val="17"/>
+                <w:sz w:val="16"/>
               </w:rPr>
               <w:t xml:space="preserve">Prec (%)</w:t>
             </w:r>
@@ -24171,7 +24171,7 @@
         </w:tc>
         <w:tc>
           <w:tcPr>
-            <w:tcW w:type="dxa" w:w="907"/>
+            <w:tcW w:type="dxa" w:w="964"/>
             <w:vAlign w:val="center"/>
           </w:tcPr>
           <w:p>
@@ -24185,7 +24185,7 @@
                 <w:rFonts w:ascii="Times New Roman" w:hAnsi="Times New Roman" w:eastAsia="Times New Roman"/>
                 <w:b/>
                 <w:bCs/>
-                <w:sz w:val="17"/>
+                <w:sz w:val="16"/>
               </w:rPr>
               <w:t xml:space="preserve">F1 (%)</w:t>
             </w:r>
@@ -24193,7 +24193,7 @@
         </w:tc>
         <w:tc>
           <w:tcPr>
-            <w:tcW w:type="dxa" w:w="907"/>
+            <w:tcW w:type="dxa" w:w="964"/>
             <w:vAlign w:val="center"/>
           </w:tcPr>
           <w:p>
@@ -24207,7 +24207,7 @@
                 <w:rFonts w:ascii="Times New Roman" w:hAnsi="Times New Roman" w:eastAsia="Times New Roman"/>
                 <w:b/>
                 <w:bCs/>
-                <w:sz w:val="17"/>
+                <w:sz w:val="16"/>
               </w:rPr>
               <w:t xml:space="preserve">Prec (%)</w:t>
             </w:r>
@@ -24229,55 +24229,75 @@
         </w:trPr>
         <w:tc>
           <w:tcPr>
+            <w:tcW w:type="dxa" w:w="850"/>
+            <w:vMerge w:val="restart"/>
+            <w:vAlign w:val="center"/>
+          </w:tcPr>
+          <w:p>
+            <w:pPr>
+              <w:pStyle w:val="Compact"/>
+              <w:spacing w:before="0" w:after="0" w:line="240" w:lineRule="auto"/>
+              <w:jc w:val="left"/>
+            </w:pPr>
+            <w:r>
+              <w:rPr>
+                <w:rFonts w:ascii="Times New Roman" w:hAnsi="Times New Roman" w:eastAsia="Times New Roman"/>
+                <w:sz w:val="16"/>
+              </w:rPr>
+              <w:t xml:space="preserve">Troms</w:t>
+            </w:r>
+            <w:r>
+              <w:rPr>
+                <w:rFonts w:ascii="Times New Roman" w:hAnsi="Times New Roman" w:eastAsia="Times New Roman"/>
+                <w:sz w:val="16"/>
+              </w:rPr>
+              <w:t xml:space="preserve">ø</w:t>
+            </w:r>
+          </w:p>
+        </w:tc>
+        <w:tc>
+          <w:tcPr>
+            <w:tcW w:type="dxa" w:w="2551"/>
+            <w:vAlign w:val="center"/>
+          </w:tcPr>
+          <w:p>
+            <w:pPr>
+              <w:pStyle w:val="Compact"/>
+              <w:spacing w:before="0" w:after="0" w:line="240" w:lineRule="auto"/>
+              <w:jc w:val="left"/>
+            </w:pPr>
+            <w:r>
+              <w:rPr>
+                <w:rFonts w:ascii="Times New Roman" w:hAnsi="Times New Roman" w:eastAsia="Times New Roman"/>
+                <w:sz w:val="16"/>
+              </w:rPr>
+              <w:t xml:space="preserve">Foreslopes (θ_align &gt; 0.3)</w:t>
+            </w:r>
+          </w:p>
+        </w:tc>
+        <w:tc>
+          <w:tcPr>
+            <w:tcW w:type="dxa" w:w="794"/>
+            <w:vAlign w:val="center"/>
+          </w:tcPr>
+          <w:p>
+            <w:pPr>
+              <w:pStyle w:val="Compact"/>
+              <w:spacing w:before="0" w:after="0" w:line="240" w:lineRule="auto"/>
+              <w:jc w:val="center"/>
+            </w:pPr>
+            <w:r>
+              <w:rPr>
+                <w:rFonts w:ascii="Times New Roman" w:hAnsi="Times New Roman" w:eastAsia="Times New Roman"/>
+                <w:sz w:val="16"/>
+              </w:rPr>
+              <w:t xml:space="preserve">15,480</w:t>
+            </w:r>
+          </w:p>
+        </w:tc>
+        <w:tc>
+          <w:tcPr>
             <w:tcW w:type="dxa" w:w="964"/>
-            <w:vMerge w:val="restart"/>
-            <w:vAlign w:val="center"/>
-          </w:tcPr>
-          <w:p>
-            <w:pPr>
-              <w:pStyle w:val="Compact"/>
-              <w:spacing w:before="0" w:after="0" w:line="240" w:lineRule="auto"/>
-              <w:jc w:val="left"/>
-            </w:pPr>
-            <w:r>
-              <w:rPr>
-                <w:rFonts w:ascii="Times New Roman" w:hAnsi="Times New Roman" w:eastAsia="Times New Roman"/>
-                <w:sz w:val="17"/>
-              </w:rPr>
-              <w:t xml:space="preserve">Troms</w:t>
-            </w:r>
-            <w:r>
-              <w:rPr>
-                <w:rFonts w:ascii="Times New Roman" w:hAnsi="Times New Roman" w:eastAsia="Times New Roman"/>
-                <w:sz w:val="17"/>
-              </w:rPr>
-              <w:t xml:space="preserve">ø</w:t>
-            </w:r>
-          </w:p>
-        </w:tc>
-        <w:tc>
-          <w:tcPr>
-            <w:tcW w:type="dxa" w:w="2551"/>
-            <w:vAlign w:val="center"/>
-          </w:tcPr>
-          <w:p>
-            <w:pPr>
-              <w:pStyle w:val="Compact"/>
-              <w:spacing w:before="0" w:after="0" w:line="240" w:lineRule="auto"/>
-              <w:jc w:val="left"/>
-            </w:pPr>
-            <w:r>
-              <w:rPr>
-                <w:rFonts w:ascii="Times New Roman" w:hAnsi="Times New Roman" w:eastAsia="Times New Roman"/>
-                <w:sz w:val="17"/>
-              </w:rPr>
-              <w:t xml:space="preserve">Foreslopes (θ_align &gt; 0.3)</w:t>
-            </w:r>
-          </w:p>
-        </w:tc>
-        <w:tc>
-          <w:tcPr>
-            <w:tcW w:type="dxa" w:w="850"/>
             <w:vAlign w:val="center"/>
           </w:tcPr>
           <w:p>
@@ -24289,15 +24309,15 @@
             <w:r>
               <w:rPr>
                 <w:rFonts w:ascii="Times New Roman" w:hAnsi="Times New Roman" w:eastAsia="Times New Roman"/>
-                <w:sz w:val="17"/>
-              </w:rPr>
-              <w:t xml:space="preserve">15,480</w:t>
-            </w:r>
-          </w:p>
-        </w:tc>
-        <w:tc>
-          <w:tcPr>
-            <w:tcW w:type="dxa" w:w="907"/>
+                <w:sz w:val="16"/>
+              </w:rPr>
+              <w:t xml:space="preserve">79.94%</w:t>
+            </w:r>
+          </w:p>
+        </w:tc>
+        <w:tc>
+          <w:tcPr>
+            <w:tcW w:type="dxa" w:w="964"/>
             <w:vAlign w:val="center"/>
           </w:tcPr>
           <w:p>
@@ -24309,15 +24329,15 @@
             <w:r>
               <w:rPr>
                 <w:rFonts w:ascii="Times New Roman" w:hAnsi="Times New Roman" w:eastAsia="Times New Roman"/>
-                <w:sz w:val="17"/>
-              </w:rPr>
-              <w:t xml:space="preserve">79.94%</w:t>
-            </w:r>
-          </w:p>
-        </w:tc>
-        <w:tc>
-          <w:tcPr>
-            <w:tcW w:type="dxa" w:w="907"/>
+                <w:sz w:val="16"/>
+              </w:rPr>
+              <w:t xml:space="preserve">73.05%</w:t>
+            </w:r>
+          </w:p>
+        </w:tc>
+        <w:tc>
+          <w:tcPr>
+            <w:tcW w:type="dxa" w:w="964"/>
             <w:vAlign w:val="center"/>
           </w:tcPr>
           <w:p>
@@ -24329,15 +24349,15 @@
             <w:r>
               <w:rPr>
                 <w:rFonts w:ascii="Times New Roman" w:hAnsi="Times New Roman" w:eastAsia="Times New Roman"/>
-                <w:sz w:val="17"/>
-              </w:rPr>
-              <w:t xml:space="preserve">73.05%</w:t>
-            </w:r>
-          </w:p>
-        </w:tc>
-        <w:tc>
-          <w:tcPr>
-            <w:tcW w:type="dxa" w:w="907"/>
+                <w:sz w:val="16"/>
+              </w:rPr>
+              <w:t xml:space="preserve">80.01%</w:t>
+            </w:r>
+          </w:p>
+        </w:tc>
+        <w:tc>
+          <w:tcPr>
+            <w:tcW w:type="dxa" w:w="964"/>
             <w:vAlign w:val="center"/>
           </w:tcPr>
           <w:p>
@@ -24349,15 +24369,15 @@
             <w:r>
               <w:rPr>
                 <w:rFonts w:ascii="Times New Roman" w:hAnsi="Times New Roman" w:eastAsia="Times New Roman"/>
-                <w:sz w:val="17"/>
-              </w:rPr>
-              <w:t xml:space="preserve">80.01%</w:t>
-            </w:r>
-          </w:p>
-        </w:tc>
-        <w:tc>
-          <w:tcPr>
-            <w:tcW w:type="dxa" w:w="907"/>
+                <w:sz w:val="16"/>
+              </w:rPr>
+              <w:t xml:space="preserve">77.44%</w:t>
+            </w:r>
+          </w:p>
+        </w:tc>
+        <w:tc>
+          <w:tcPr>
+            <w:tcW w:type="dxa" w:w="964"/>
             <w:vAlign w:val="center"/>
           </w:tcPr>
           <w:p>
@@ -24369,27 +24389,7 @@
             <w:r>
               <w:rPr>
                 <w:rFonts w:ascii="Times New Roman" w:hAnsi="Times New Roman" w:eastAsia="Times New Roman"/>
-                <w:sz w:val="17"/>
-              </w:rPr>
-              <w:t xml:space="preserve">77.44%</w:t>
-            </w:r>
-          </w:p>
-        </w:tc>
-        <w:tc>
-          <w:tcPr>
-            <w:tcW w:type="dxa" w:w="794"/>
-            <w:vAlign w:val="center"/>
-          </w:tcPr>
-          <w:p>
-            <w:pPr>
-              <w:pStyle w:val="Compact"/>
-              <w:spacing w:before="0" w:after="0" w:line="240" w:lineRule="auto"/>
-              <w:jc w:val="center"/>
-            </w:pPr>
-            <w:r>
-              <w:rPr>
-                <w:rFonts w:ascii="Times New Roman" w:hAnsi="Times New Roman" w:eastAsia="Times New Roman"/>
-                <w:sz w:val="17"/>
+                <w:sz w:val="16"/>
               </w:rPr>
               <w:t xml:space="preserve">-0.07%</w:t>
             </w:r>
@@ -24423,7 +24423,7 @@
             <w:r>
               <w:rPr>
                 <w:rFonts w:ascii="Times New Roman" w:hAnsi="Times New Roman" w:eastAsia="Times New Roman"/>
-                <w:sz w:val="17"/>
+                <w:sz w:val="16"/>
               </w:rPr>
               <w:t xml:space="preserve">Cross-slopes (|θ_align| ≤ 0.3)</w:t>
             </w:r>
@@ -24431,7 +24431,7 @@
         </w:tc>
         <w:tc>
           <w:tcPr>
-            <w:tcW w:type="dxa" w:w="850"/>
+            <w:tcW w:type="dxa" w:w="794"/>
             <w:vAlign w:val="center"/>
           </w:tcPr>
           <w:p>
@@ -24443,7 +24443,7 @@
             <w:r>
               <w:rPr>
                 <w:rFonts w:ascii="Times New Roman" w:hAnsi="Times New Roman" w:eastAsia="Times New Roman"/>
-                <w:sz w:val="17"/>
+                <w:sz w:val="16"/>
               </w:rPr>
               <w:t xml:space="preserve">3,113</w:t>
             </w:r>
@@ -24451,7 +24451,7 @@
         </w:tc>
         <w:tc>
           <w:tcPr>
-            <w:tcW w:type="dxa" w:w="907"/>
+            <w:tcW w:type="dxa" w:w="964"/>
             <w:vAlign w:val="center"/>
           </w:tcPr>
           <w:p>
@@ -24463,7 +24463,7 @@
             <w:r>
               <w:rPr>
                 <w:rFonts w:ascii="Times New Roman" w:hAnsi="Times New Roman" w:eastAsia="Times New Roman"/>
-                <w:sz w:val="17"/>
+                <w:sz w:val="16"/>
               </w:rPr>
               <w:t xml:space="preserve">68.93%</w:t>
             </w:r>
@@ -24471,7 +24471,7 @@
         </w:tc>
         <w:tc>
           <w:tcPr>
-            <w:tcW w:type="dxa" w:w="907"/>
+            <w:tcW w:type="dxa" w:w="964"/>
             <w:vAlign w:val="center"/>
           </w:tcPr>
           <w:p>
@@ -24483,7 +24483,7 @@
             <w:r>
               <w:rPr>
                 <w:rFonts w:ascii="Times New Roman" w:hAnsi="Times New Roman" w:eastAsia="Times New Roman"/>
-                <w:sz w:val="17"/>
+                <w:sz w:val="16"/>
               </w:rPr>
               <w:t xml:space="preserve">63.19%</w:t>
             </w:r>
@@ -24491,7 +24491,7 @@
         </w:tc>
         <w:tc>
           <w:tcPr>
-            <w:tcW w:type="dxa" w:w="907"/>
+            <w:tcW w:type="dxa" w:w="964"/>
             <w:vAlign w:val="center"/>
           </w:tcPr>
           <w:p>
@@ -24503,7 +24503,7 @@
             <w:r>
               <w:rPr>
                 <w:rFonts w:ascii="Times New Roman" w:hAnsi="Times New Roman" w:eastAsia="Times New Roman"/>
-                <w:sz w:val="17"/>
+                <w:sz w:val="16"/>
               </w:rPr>
               <w:t xml:space="preserve">69.43%</w:t>
             </w:r>
@@ -24511,7 +24511,7 @@
         </w:tc>
         <w:tc>
           <w:tcPr>
-            <w:tcW w:type="dxa" w:w="907"/>
+            <w:tcW w:type="dxa" w:w="964"/>
             <w:vAlign w:val="center"/>
           </w:tcPr>
           <w:p>
@@ -24523,7 +24523,7 @@
             <w:r>
               <w:rPr>
                 <w:rFonts w:ascii="Times New Roman" w:hAnsi="Times New Roman" w:eastAsia="Times New Roman"/>
-                <w:sz w:val="17"/>
+                <w:sz w:val="16"/>
               </w:rPr>
               <w:t xml:space="preserve">73.57%</w:t>
             </w:r>
@@ -24531,7 +24531,7 @@
         </w:tc>
         <w:tc>
           <w:tcPr>
-            <w:tcW w:type="dxa" w:w="794"/>
+            <w:tcW w:type="dxa" w:w="964"/>
             <w:vAlign w:val="center"/>
           </w:tcPr>
           <w:p>
@@ -24543,7 +24543,7 @@
             <w:r>
               <w:rPr>
                 <w:rFonts w:ascii="Times New Roman" w:hAnsi="Times New Roman" w:eastAsia="Times New Roman"/>
-                <w:sz w:val="17"/>
+                <w:sz w:val="16"/>
               </w:rPr>
               <w:t xml:space="preserve">-0.50%</w:t>
             </w:r>
@@ -24579,7 +24579,7 @@
                 <w:rFonts w:ascii="Times New Roman" w:hAnsi="Times New Roman" w:eastAsia="Times New Roman"/>
                 <w:b/>
                 <w:bCs/>
-                <w:sz w:val="17"/>
+                <w:sz w:val="16"/>
               </w:rPr>
               <w:t xml:space="preserve">Backslopes (θ_align &lt; -0.3)</w:t>
             </w:r>
@@ -24587,7 +24587,7 @@
         </w:tc>
         <w:tc>
           <w:tcPr>
-            <w:tcW w:type="dxa" w:w="850"/>
+            <w:tcW w:type="dxa" w:w="794"/>
             <w:vAlign w:val="center"/>
           </w:tcPr>
           <w:p>
@@ -24601,7 +24601,7 @@
                 <w:rFonts w:ascii="Times New Roman" w:hAnsi="Times New Roman" w:eastAsia="Times New Roman"/>
                 <w:b/>
                 <w:bCs/>
-                <w:sz w:val="17"/>
+                <w:sz w:val="16"/>
               </w:rPr>
               <w:t xml:space="preserve">15,376</w:t>
             </w:r>
@@ -24609,7 +24609,7 @@
         </w:tc>
         <w:tc>
           <w:tcPr>
-            <w:tcW w:type="dxa" w:w="907"/>
+            <w:tcW w:type="dxa" w:w="964"/>
             <w:vAlign w:val="center"/>
           </w:tcPr>
           <w:p>
@@ -24623,7 +24623,7 @@
                 <w:rFonts w:ascii="Times New Roman" w:hAnsi="Times New Roman" w:eastAsia="Times New Roman"/>
                 <w:b/>
                 <w:bCs/>
-                <w:sz w:val="17"/>
+                <w:sz w:val="16"/>
               </w:rPr>
               <w:t xml:space="preserve">81.08%</w:t>
             </w:r>
@@ -24631,7 +24631,7 @@
         </w:tc>
         <w:tc>
           <w:tcPr>
-            <w:tcW w:type="dxa" w:w="907"/>
+            <w:tcW w:type="dxa" w:w="964"/>
             <w:vAlign w:val="center"/>
           </w:tcPr>
           <w:p>
@@ -24645,7 +24645,7 @@
                 <w:rFonts w:ascii="Times New Roman" w:hAnsi="Times New Roman" w:eastAsia="Times New Roman"/>
                 <w:b/>
                 <w:bCs/>
-                <w:sz w:val="17"/>
+                <w:sz w:val="16"/>
               </w:rPr>
               <w:t xml:space="preserve">85.03%</w:t>
             </w:r>
@@ -24653,7 +24653,7 @@
         </w:tc>
         <w:tc>
           <w:tcPr>
-            <w:tcW w:type="dxa" w:w="907"/>
+            <w:tcW w:type="dxa" w:w="964"/>
             <w:vAlign w:val="center"/>
           </w:tcPr>
           <w:p>
@@ -24665,7 +24665,7 @@
             <w:r>
               <w:rPr>
                 <w:rFonts w:ascii="Times New Roman" w:hAnsi="Times New Roman" w:eastAsia="Times New Roman"/>
-                <w:sz w:val="17"/>
+                <w:sz w:val="16"/>
               </w:rPr>
               <w:t xml:space="preserve">75.23%</w:t>
             </w:r>
@@ -24673,7 +24673,7 @@
         </w:tc>
         <w:tc>
           <w:tcPr>
-            <w:tcW w:type="dxa" w:w="907"/>
+            <w:tcW w:type="dxa" w:w="964"/>
             <w:vAlign w:val="center"/>
           </w:tcPr>
           <w:p>
@@ -24685,7 +24685,7 @@
             <w:r>
               <w:rPr>
                 <w:rFonts w:ascii="Times New Roman" w:hAnsi="Times New Roman" w:eastAsia="Times New Roman"/>
-                <w:sz w:val="17"/>
+                <w:sz w:val="16"/>
               </w:rPr>
               <w:t xml:space="preserve">88.90%</w:t>
             </w:r>
@@ -24693,7 +24693,7 @@
         </w:tc>
         <w:tc>
           <w:tcPr>
-            <w:tcW w:type="dxa" w:w="794"/>
+            <w:tcW w:type="dxa" w:w="964"/>
             <w:vAlign w:val="center"/>
           </w:tcPr>
           <w:p>
@@ -24707,7 +24707,7 @@
                 <w:rFonts w:ascii="Times New Roman" w:hAnsi="Times New Roman" w:eastAsia="Times New Roman"/>
                 <w:b/>
                 <w:bCs/>
-                <w:sz w:val="17"/>
+                <w:sz w:val="16"/>
               </w:rPr>
               <w:t xml:space="preserve">+5.85%</w:t>
             </w:r>
@@ -24741,7 +24741,7 @@
             <w:r>
               <w:rPr>
                 <w:rFonts w:ascii="Times New Roman" w:hAnsi="Times New Roman" w:eastAsia="Times New Roman"/>
-                <w:sz w:val="17"/>
+                <w:sz w:val="16"/>
               </w:rPr>
               <w:t xml:space="preserve">Runout &amp; Valleys (&lt; 25°)</w:t>
             </w:r>
@@ -24749,7 +24749,7 @@
         </w:tc>
         <w:tc>
           <w:tcPr>
-            <w:tcW w:type="dxa" w:w="850"/>
+            <w:tcW w:type="dxa" w:w="794"/>
             <w:vAlign w:val="center"/>
           </w:tcPr>
           <w:p>
@@ -24761,7 +24761,7 @@
             <w:r>
               <w:rPr>
                 <w:rFonts w:ascii="Times New Roman" w:hAnsi="Times New Roman" w:eastAsia="Times New Roman"/>
-                <w:sz w:val="17"/>
+                <w:sz w:val="16"/>
               </w:rPr>
               <w:t xml:space="preserve">12,360</w:t>
             </w:r>
@@ -24769,7 +24769,7 @@
         </w:tc>
         <w:tc>
           <w:tcPr>
-            <w:tcW w:type="dxa" w:w="907"/>
+            <w:tcW w:type="dxa" w:w="964"/>
             <w:vAlign w:val="center"/>
           </w:tcPr>
           <w:p>
@@ -24781,7 +24781,7 @@
             <w:r>
               <w:rPr>
                 <w:rFonts w:ascii="Times New Roman" w:hAnsi="Times New Roman" w:eastAsia="Times New Roman"/>
-                <w:sz w:val="17"/>
+                <w:sz w:val="16"/>
               </w:rPr>
               <w:t xml:space="preserve">76.76%</w:t>
             </w:r>
@@ -24789,7 +24789,7 @@
         </w:tc>
         <w:tc>
           <w:tcPr>
-            <w:tcW w:type="dxa" w:w="907"/>
+            <w:tcW w:type="dxa" w:w="964"/>
             <w:vAlign w:val="center"/>
           </w:tcPr>
           <w:p>
@@ -24801,7 +24801,7 @@
             <w:r>
               <w:rPr>
                 <w:rFonts w:ascii="Times New Roman" w:hAnsi="Times New Roman" w:eastAsia="Times New Roman"/>
-                <w:sz w:val="17"/>
+                <w:sz w:val="16"/>
               </w:rPr>
               <w:t xml:space="preserve">70.68%</w:t>
             </w:r>
@@ -24809,7 +24809,7 @@
         </w:tc>
         <w:tc>
           <w:tcPr>
-            <w:tcW w:type="dxa" w:w="907"/>
+            <w:tcW w:type="dxa" w:w="964"/>
             <w:vAlign w:val="center"/>
           </w:tcPr>
           <w:p>
@@ -24821,7 +24821,7 @@
             <w:r>
               <w:rPr>
                 <w:rFonts w:ascii="Times New Roman" w:hAnsi="Times New Roman" w:eastAsia="Times New Roman"/>
-                <w:sz w:val="17"/>
+                <w:sz w:val="16"/>
               </w:rPr>
               <w:t xml:space="preserve">77.91%</w:t>
             </w:r>
@@ -24829,7 +24829,7 @@
         </w:tc>
         <w:tc>
           <w:tcPr>
-            <w:tcW w:type="dxa" w:w="907"/>
+            <w:tcW w:type="dxa" w:w="964"/>
             <w:vAlign w:val="center"/>
           </w:tcPr>
           <w:p>
@@ -24841,7 +24841,7 @@
             <w:r>
               <w:rPr>
                 <w:rFonts w:ascii="Times New Roman" w:hAnsi="Times New Roman" w:eastAsia="Times New Roman"/>
-                <w:sz w:val="17"/>
+                <w:sz w:val="16"/>
               </w:rPr>
               <w:t xml:space="preserve">76.23%</w:t>
             </w:r>
@@ -24849,7 +24849,7 @@
         </w:tc>
         <w:tc>
           <w:tcPr>
-            <w:tcW w:type="dxa" w:w="794"/>
+            <w:tcW w:type="dxa" w:w="964"/>
             <w:vAlign w:val="center"/>
           </w:tcPr>
           <w:p>
@@ -24861,7 +24861,7 @@
             <w:r>
               <w:rPr>
                 <w:rFonts w:ascii="Times New Roman" w:hAnsi="Times New Roman" w:eastAsia="Times New Roman"/>
-                <w:sz w:val="17"/>
+                <w:sz w:val="16"/>
               </w:rPr>
               <w:t xml:space="preserve">-1.15%</w:t>
             </w:r>
@@ -24897,7 +24897,7 @@
                 <w:rFonts w:ascii="Times New Roman" w:hAnsi="Times New Roman" w:eastAsia="Times New Roman"/>
                 <w:b/>
                 <w:bCs/>
-                <w:sz w:val="17"/>
+                <w:sz w:val="16"/>
               </w:rPr>
               <w:t xml:space="preserve">Avalanche Chutes (25°–45°)</w:t>
             </w:r>
@@ -24905,7 +24905,7 @@
         </w:tc>
         <w:tc>
           <w:tcPr>
-            <w:tcW w:type="dxa" w:w="850"/>
+            <w:tcW w:type="dxa" w:w="794"/>
             <w:vAlign w:val="center"/>
           </w:tcPr>
           <w:p>
@@ -24919,7 +24919,7 @@
                 <w:rFonts w:ascii="Times New Roman" w:hAnsi="Times New Roman" w:eastAsia="Times New Roman"/>
                 <w:b/>
                 <w:bCs/>
-                <w:sz w:val="17"/>
+                <w:sz w:val="16"/>
               </w:rPr>
               <w:t xml:space="preserve">21,118</w:t>
             </w:r>
@@ -24927,7 +24927,7 @@
         </w:tc>
         <w:tc>
           <w:tcPr>
-            <w:tcW w:type="dxa" w:w="907"/>
+            <w:tcW w:type="dxa" w:w="964"/>
             <w:vAlign w:val="center"/>
           </w:tcPr>
           <w:p>
@@ -24941,7 +24941,7 @@
                 <w:rFonts w:ascii="Times New Roman" w:hAnsi="Times New Roman" w:eastAsia="Times New Roman"/>
                 <w:b/>
                 <w:bCs/>
-                <w:sz w:val="17"/>
+                <w:sz w:val="16"/>
               </w:rPr>
               <w:t xml:space="preserve">81.34%</w:t>
             </w:r>
@@ -24949,7 +24949,7 @@
         </w:tc>
         <w:tc>
           <w:tcPr>
-            <w:tcW w:type="dxa" w:w="907"/>
+            <w:tcW w:type="dxa" w:w="964"/>
             <w:vAlign w:val="center"/>
           </w:tcPr>
           <w:p>
@@ -24963,7 +24963,7 @@
                 <w:rFonts w:ascii="Times New Roman" w:hAnsi="Times New Roman" w:eastAsia="Times New Roman"/>
                 <w:b/>
                 <w:bCs/>
-                <w:sz w:val="17"/>
+                <w:sz w:val="16"/>
               </w:rPr>
               <w:t xml:space="preserve">80.94%</w:t>
             </w:r>
@@ -24971,7 +24971,7 @@
         </w:tc>
         <w:tc>
           <w:tcPr>
-            <w:tcW w:type="dxa" w:w="907"/>
+            <w:tcW w:type="dxa" w:w="964"/>
             <w:vAlign w:val="center"/>
           </w:tcPr>
           <w:p>
@@ -24983,7 +24983,7 @@
             <w:r>
               <w:rPr>
                 <w:rFonts w:ascii="Times New Roman" w:hAnsi="Times New Roman" w:eastAsia="Times New Roman"/>
-                <w:sz w:val="17"/>
+                <w:sz w:val="16"/>
               </w:rPr>
               <w:t xml:space="preserve">77.00%</w:t>
             </w:r>
@@ -24991,7 +24991,7 @@
         </w:tc>
         <w:tc>
           <w:tcPr>
-            <w:tcW w:type="dxa" w:w="907"/>
+            <w:tcW w:type="dxa" w:w="964"/>
             <w:vAlign w:val="center"/>
           </w:tcPr>
           <w:p>
@@ -25003,7 +25003,7 @@
             <w:r>
               <w:rPr>
                 <w:rFonts w:ascii="Times New Roman" w:hAnsi="Times New Roman" w:eastAsia="Times New Roman"/>
-                <w:sz w:val="17"/>
+                <w:sz w:val="16"/>
               </w:rPr>
               <w:t xml:space="preserve">85.33%</w:t>
             </w:r>
@@ -25011,7 +25011,7 @@
         </w:tc>
         <w:tc>
           <w:tcPr>
-            <w:tcW w:type="dxa" w:w="794"/>
+            <w:tcW w:type="dxa" w:w="964"/>
             <w:vAlign w:val="center"/>
           </w:tcPr>
           <w:p>
@@ -25025,7 +25025,7 @@
                 <w:rFonts w:ascii="Times New Roman" w:hAnsi="Times New Roman" w:eastAsia="Times New Roman"/>
                 <w:b/>
                 <w:bCs/>
-                <w:sz w:val="17"/>
+                <w:sz w:val="16"/>
               </w:rPr>
               <w:t xml:space="preserve">+4.34%</w:t>
             </w:r>
@@ -25059,7 +25059,7 @@
             <w:r>
               <w:rPr>
                 <w:rFonts w:ascii="Times New Roman" w:hAnsi="Times New Roman" w:eastAsia="Times New Roman"/>
-                <w:sz w:val="17"/>
+                <w:sz w:val="16"/>
               </w:rPr>
               <w:t xml:space="preserve">Extreme Steep (&gt; 45°)</w:t>
             </w:r>
@@ -25067,7 +25067,7 @@
         </w:tc>
         <w:tc>
           <w:tcPr>
-            <w:tcW w:type="dxa" w:w="850"/>
+            <w:tcW w:type="dxa" w:w="794"/>
             <w:vAlign w:val="center"/>
           </w:tcPr>
           <w:p>
@@ -25079,7 +25079,7 @@
             <w:r>
               <w:rPr>
                 <w:rFonts w:ascii="Times New Roman" w:hAnsi="Times New Roman" w:eastAsia="Times New Roman"/>
-                <w:sz w:val="17"/>
+                <w:sz w:val="16"/>
               </w:rPr>
               <w:t xml:space="preserve">491</w:t>
             </w:r>
@@ -25087,7 +25087,7 @@
         </w:tc>
         <w:tc>
           <w:tcPr>
-            <w:tcW w:type="dxa" w:w="907"/>
+            <w:tcW w:type="dxa" w:w="964"/>
             <w:vAlign w:val="center"/>
           </w:tcPr>
           <w:p>
@@ -25099,7 +25099,7 @@
             <w:r>
               <w:rPr>
                 <w:rFonts w:ascii="Times New Roman" w:hAnsi="Times New Roman" w:eastAsia="Times New Roman"/>
-                <w:sz w:val="17"/>
+                <w:sz w:val="16"/>
               </w:rPr>
               <w:t xml:space="preserve">63.37%</w:t>
             </w:r>
@@ -25107,7 +25107,7 @@
         </w:tc>
         <w:tc>
           <w:tcPr>
-            <w:tcW w:type="dxa" w:w="907"/>
+            <w:tcW w:type="dxa" w:w="964"/>
             <w:vAlign w:val="center"/>
           </w:tcPr>
           <w:p>
@@ -25119,7 +25119,7 @@
             <w:r>
               <w:rPr>
                 <w:rFonts w:ascii="Times New Roman" w:hAnsi="Times New Roman" w:eastAsia="Times New Roman"/>
-                <w:sz w:val="17"/>
+                <w:sz w:val="16"/>
               </w:rPr>
               <w:t xml:space="preserve">67.05%</w:t>
             </w:r>
@@ -25127,7 +25127,7 @@
         </w:tc>
         <w:tc>
           <w:tcPr>
-            <w:tcW w:type="dxa" w:w="907"/>
+            <w:tcW w:type="dxa" w:w="964"/>
             <w:vAlign w:val="center"/>
           </w:tcPr>
           <w:p>
@@ -25139,7 +25139,7 @@
             <w:r>
               <w:rPr>
                 <w:rFonts w:ascii="Times New Roman" w:hAnsi="Times New Roman" w:eastAsia="Times New Roman"/>
-                <w:sz w:val="17"/>
+                <w:sz w:val="16"/>
               </w:rPr>
               <w:t xml:space="preserve">54.23%</w:t>
             </w:r>
@@ -25147,7 +25147,7 @@
         </w:tc>
         <w:tc>
           <w:tcPr>
-            <w:tcW w:type="dxa" w:w="907"/>
+            <w:tcW w:type="dxa" w:w="964"/>
             <w:vAlign w:val="center"/>
           </w:tcPr>
           <w:p>
@@ -25159,7 +25159,7 @@
             <w:r>
               <w:rPr>
                 <w:rFonts w:ascii="Times New Roman" w:hAnsi="Times New Roman" w:eastAsia="Times New Roman"/>
-                <w:sz w:val="17"/>
+                <w:sz w:val="16"/>
               </w:rPr>
               <w:t xml:space="preserve">68.21%</w:t>
             </w:r>
@@ -25167,7 +25167,7 @@
         </w:tc>
         <w:tc>
           <w:tcPr>
-            <w:tcW w:type="dxa" w:w="794"/>
+            <w:tcW w:type="dxa" w:w="964"/>
             <w:vAlign w:val="center"/>
           </w:tcPr>
           <w:p>
@@ -25181,7 +25181,7 @@
                 <w:rFonts w:ascii="Times New Roman" w:hAnsi="Times New Roman" w:eastAsia="Times New Roman"/>
                 <w:b/>
                 <w:bCs/>
-                <w:sz w:val="17"/>
+                <w:sz w:val="16"/>
               </w:rPr>
               <w:t xml:space="preserve">+9.14%</w:t>
             </w:r>
@@ -25194,48 +25194,68 @@
         </w:trPr>
         <w:tc>
           <w:tcPr>
+            <w:tcW w:type="dxa" w:w="850"/>
+            <w:vMerge w:val="restart"/>
+            <w:vAlign w:val="center"/>
+          </w:tcPr>
+          <w:p>
+            <w:pPr>
+              <w:pStyle w:val="Compact"/>
+              <w:spacing w:before="0" w:after="0" w:line="240" w:lineRule="auto"/>
+              <w:jc w:val="left"/>
+            </w:pPr>
+            <w:r>
+              <w:rPr>
+                <w:rFonts w:ascii="Times New Roman" w:hAnsi="Times New Roman" w:eastAsia="Times New Roman"/>
+                <w:sz w:val="16"/>
+              </w:rPr>
+              <w:t xml:space="preserve">Pamir</w:t>
+            </w:r>
+          </w:p>
+        </w:tc>
+        <w:tc>
+          <w:tcPr>
+            <w:tcW w:type="dxa" w:w="2551"/>
+            <w:vAlign w:val="center"/>
+          </w:tcPr>
+          <w:p>
+            <w:pPr>
+              <w:pStyle w:val="Compact"/>
+              <w:spacing w:before="0" w:after="0" w:line="240" w:lineRule="auto"/>
+              <w:jc w:val="left"/>
+            </w:pPr>
+            <w:r>
+              <w:rPr>
+                <w:rFonts w:ascii="Times New Roman" w:hAnsi="Times New Roman" w:eastAsia="Times New Roman"/>
+                <w:sz w:val="16"/>
+              </w:rPr>
+              <w:t xml:space="preserve">Foreslopes (θ_align &gt; 0.3)</w:t>
+            </w:r>
+          </w:p>
+        </w:tc>
+        <w:tc>
+          <w:tcPr>
+            <w:tcW w:type="dxa" w:w="794"/>
+            <w:vAlign w:val="center"/>
+          </w:tcPr>
+          <w:p>
+            <w:pPr>
+              <w:pStyle w:val="Compact"/>
+              <w:spacing w:before="0" w:after="0" w:line="240" w:lineRule="auto"/>
+              <w:jc w:val="center"/>
+            </w:pPr>
+            <w:r>
+              <w:rPr>
+                <w:rFonts w:ascii="Times New Roman" w:hAnsi="Times New Roman" w:eastAsia="Times New Roman"/>
+                <w:sz w:val="16"/>
+              </w:rPr>
+              <w:t xml:space="preserve">14,743</w:t>
+            </w:r>
+          </w:p>
+        </w:tc>
+        <w:tc>
+          <w:tcPr>
             <w:tcW w:type="dxa" w:w="964"/>
-            <w:vMerge w:val="restart"/>
-            <w:vAlign w:val="center"/>
-          </w:tcPr>
-          <w:p>
-            <w:pPr>
-              <w:pStyle w:val="Compact"/>
-              <w:spacing w:before="0" w:after="0" w:line="240" w:lineRule="auto"/>
-              <w:jc w:val="left"/>
-            </w:pPr>
-            <w:r>
-              <w:rPr>
-                <w:rFonts w:ascii="Times New Roman" w:hAnsi="Times New Roman" w:eastAsia="Times New Roman"/>
-                <w:sz w:val="17"/>
-              </w:rPr>
-              <w:t xml:space="preserve">Pamir</w:t>
-            </w:r>
-          </w:p>
-        </w:tc>
-        <w:tc>
-          <w:tcPr>
-            <w:tcW w:type="dxa" w:w="2551"/>
-            <w:vAlign w:val="center"/>
-          </w:tcPr>
-          <w:p>
-            <w:pPr>
-              <w:pStyle w:val="Compact"/>
-              <w:spacing w:before="0" w:after="0" w:line="240" w:lineRule="auto"/>
-              <w:jc w:val="left"/>
-            </w:pPr>
-            <w:r>
-              <w:rPr>
-                <w:rFonts w:ascii="Times New Roman" w:hAnsi="Times New Roman" w:eastAsia="Times New Roman"/>
-                <w:sz w:val="17"/>
-              </w:rPr>
-              <w:t xml:space="preserve">Foreslopes (θ_align &gt; 0.3)</w:t>
-            </w:r>
-          </w:p>
-        </w:tc>
-        <w:tc>
-          <w:tcPr>
-            <w:tcW w:type="dxa" w:w="850"/>
             <w:vAlign w:val="center"/>
           </w:tcPr>
           <w:p>
@@ -25247,15 +25267,15 @@
             <w:r>
               <w:rPr>
                 <w:rFonts w:ascii="Times New Roman" w:hAnsi="Times New Roman" w:eastAsia="Times New Roman"/>
-                <w:sz w:val="17"/>
-              </w:rPr>
-              <w:t xml:space="preserve">14,743</w:t>
-            </w:r>
-          </w:p>
-        </w:tc>
-        <w:tc>
-          <w:tcPr>
-            <w:tcW w:type="dxa" w:w="907"/>
+                <w:sz w:val="16"/>
+              </w:rPr>
+              <w:t xml:space="preserve">51.27%</w:t>
+            </w:r>
+          </w:p>
+        </w:tc>
+        <w:tc>
+          <w:tcPr>
+            <w:tcW w:type="dxa" w:w="964"/>
             <w:vAlign w:val="center"/>
           </w:tcPr>
           <w:p>
@@ -25267,15 +25287,15 @@
             <w:r>
               <w:rPr>
                 <w:rFonts w:ascii="Times New Roman" w:hAnsi="Times New Roman" w:eastAsia="Times New Roman"/>
-                <w:sz w:val="17"/>
-              </w:rPr>
-              <w:t xml:space="preserve">51.27%</w:t>
-            </w:r>
-          </w:p>
-        </w:tc>
-        <w:tc>
-          <w:tcPr>
-            <w:tcW w:type="dxa" w:w="907"/>
+                <w:sz w:val="16"/>
+              </w:rPr>
+              <w:t xml:space="preserve">43.87%</w:t>
+            </w:r>
+          </w:p>
+        </w:tc>
+        <w:tc>
+          <w:tcPr>
+            <w:tcW w:type="dxa" w:w="964"/>
             <w:vAlign w:val="center"/>
           </w:tcPr>
           <w:p>
@@ -25287,15 +25307,15 @@
             <w:r>
               <w:rPr>
                 <w:rFonts w:ascii="Times New Roman" w:hAnsi="Times New Roman" w:eastAsia="Times New Roman"/>
-                <w:sz w:val="17"/>
-              </w:rPr>
-              <w:t xml:space="preserve">43.87%</w:t>
-            </w:r>
-          </w:p>
-        </w:tc>
-        <w:tc>
-          <w:tcPr>
-            <w:tcW w:type="dxa" w:w="907"/>
+                <w:sz w:val="16"/>
+              </w:rPr>
+              <w:t xml:space="preserve">50.13%</w:t>
+            </w:r>
+          </w:p>
+        </w:tc>
+        <w:tc>
+          <w:tcPr>
+            <w:tcW w:type="dxa" w:w="964"/>
             <w:vAlign w:val="center"/>
           </w:tcPr>
           <w:p>
@@ -25307,15 +25327,15 @@
             <w:r>
               <w:rPr>
                 <w:rFonts w:ascii="Times New Roman" w:hAnsi="Times New Roman" w:eastAsia="Times New Roman"/>
-                <w:sz w:val="17"/>
-              </w:rPr>
-              <w:t xml:space="preserve">50.13%</w:t>
-            </w:r>
-          </w:p>
-        </w:tc>
-        <w:tc>
-          <w:tcPr>
-            <w:tcW w:type="dxa" w:w="907"/>
+                <w:sz w:val="16"/>
+              </w:rPr>
+              <w:t xml:space="preserve">42.84%</w:t>
+            </w:r>
+          </w:p>
+        </w:tc>
+        <w:tc>
+          <w:tcPr>
+            <w:tcW w:type="dxa" w:w="964"/>
             <w:vAlign w:val="center"/>
           </w:tcPr>
           <w:p>
@@ -25327,27 +25347,7 @@
             <w:r>
               <w:rPr>
                 <w:rFonts w:ascii="Times New Roman" w:hAnsi="Times New Roman" w:eastAsia="Times New Roman"/>
-                <w:sz w:val="17"/>
-              </w:rPr>
-              <w:t xml:space="preserve">42.84%</w:t>
-            </w:r>
-          </w:p>
-        </w:tc>
-        <w:tc>
-          <w:tcPr>
-            <w:tcW w:type="dxa" w:w="794"/>
-            <w:vAlign w:val="center"/>
-          </w:tcPr>
-          <w:p>
-            <w:pPr>
-              <w:pStyle w:val="Compact"/>
-              <w:spacing w:before="0" w:after="0" w:line="240" w:lineRule="auto"/>
-              <w:jc w:val="center"/>
-            </w:pPr>
-            <w:r>
-              <w:rPr>
-                <w:rFonts w:ascii="Times New Roman" w:hAnsi="Times New Roman" w:eastAsia="Times New Roman"/>
-                <w:sz w:val="17"/>
+                <w:sz w:val="16"/>
               </w:rPr>
               <w:t xml:space="preserve">+1.14%</w:t>
             </w:r>
@@ -25381,7 +25381,7 @@
             <w:r>
               <w:rPr>
                 <w:rFonts w:ascii="Times New Roman" w:hAnsi="Times New Roman" w:eastAsia="Times New Roman"/>
-                <w:sz w:val="17"/>
+                <w:sz w:val="16"/>
               </w:rPr>
               <w:t xml:space="preserve">Cross-slopes (|θ_align| ≤ 0.3)</w:t>
             </w:r>
@@ -25389,7 +25389,7 @@
         </w:tc>
         <w:tc>
           <w:tcPr>
-            <w:tcW w:type="dxa" w:w="850"/>
+            <w:tcW w:type="dxa" w:w="794"/>
             <w:vAlign w:val="center"/>
           </w:tcPr>
           <w:p>
@@ -25401,7 +25401,7 @@
             <w:r>
               <w:rPr>
                 <w:rFonts w:ascii="Times New Roman" w:hAnsi="Times New Roman" w:eastAsia="Times New Roman"/>
-                <w:sz w:val="17"/>
+                <w:sz w:val="16"/>
               </w:rPr>
               <w:t xml:space="preserve">2,614</w:t>
             </w:r>
@@ -25409,7 +25409,7 @@
         </w:tc>
         <w:tc>
           <w:tcPr>
-            <w:tcW w:type="dxa" w:w="907"/>
+            <w:tcW w:type="dxa" w:w="964"/>
             <w:vAlign w:val="center"/>
           </w:tcPr>
           <w:p>
@@ -25421,7 +25421,7 @@
             <w:r>
               <w:rPr>
                 <w:rFonts w:ascii="Times New Roman" w:hAnsi="Times New Roman" w:eastAsia="Times New Roman"/>
-                <w:sz w:val="17"/>
+                <w:sz w:val="16"/>
               </w:rPr>
               <w:t xml:space="preserve">46.96%</w:t>
             </w:r>
@@ -25429,7 +25429,7 @@
         </w:tc>
         <w:tc>
           <w:tcPr>
-            <w:tcW w:type="dxa" w:w="907"/>
+            <w:tcW w:type="dxa" w:w="964"/>
             <w:vAlign w:val="center"/>
           </w:tcPr>
           <w:p>
@@ -25441,7 +25441,7 @@
             <w:r>
               <w:rPr>
                 <w:rFonts w:ascii="Times New Roman" w:hAnsi="Times New Roman" w:eastAsia="Times New Roman"/>
-                <w:sz w:val="17"/>
+                <w:sz w:val="16"/>
               </w:rPr>
               <w:t xml:space="preserve">43.37%</w:t>
             </w:r>
@@ -25449,7 +25449,7 @@
         </w:tc>
         <w:tc>
           <w:tcPr>
-            <w:tcW w:type="dxa" w:w="907"/>
+            <w:tcW w:type="dxa" w:w="964"/>
             <w:vAlign w:val="center"/>
           </w:tcPr>
           <w:p>
@@ -25461,7 +25461,7 @@
             <w:r>
               <w:rPr>
                 <w:rFonts w:ascii="Times New Roman" w:hAnsi="Times New Roman" w:eastAsia="Times New Roman"/>
-                <w:sz w:val="17"/>
+                <w:sz w:val="16"/>
               </w:rPr>
               <w:t xml:space="preserve">46.92%</w:t>
             </w:r>
@@ -25469,7 +25469,7 @@
         </w:tc>
         <w:tc>
           <w:tcPr>
-            <w:tcW w:type="dxa" w:w="907"/>
+            <w:tcW w:type="dxa" w:w="964"/>
             <w:vAlign w:val="center"/>
           </w:tcPr>
           <w:p>
@@ -25481,7 +25481,7 @@
             <w:r>
               <w:rPr>
                 <w:rFonts w:ascii="Times New Roman" w:hAnsi="Times New Roman" w:eastAsia="Times New Roman"/>
-                <w:sz w:val="17"/>
+                <w:sz w:val="16"/>
               </w:rPr>
               <w:t xml:space="preserve">37.60%</w:t>
             </w:r>
@@ -25489,7 +25489,7 @@
         </w:tc>
         <w:tc>
           <w:tcPr>
-            <w:tcW w:type="dxa" w:w="794"/>
+            <w:tcW w:type="dxa" w:w="964"/>
             <w:vAlign w:val="center"/>
           </w:tcPr>
           <w:p>
@@ -25501,7 +25501,7 @@
             <w:r>
               <w:rPr>
                 <w:rFonts w:ascii="Times New Roman" w:hAnsi="Times New Roman" w:eastAsia="Times New Roman"/>
-                <w:sz w:val="17"/>
+                <w:sz w:val="16"/>
               </w:rPr>
               <w:t xml:space="preserve">+0.03%</w:t>
             </w:r>
@@ -25537,7 +25537,7 @@
                 <w:rFonts w:ascii="Times New Roman" w:hAnsi="Times New Roman" w:eastAsia="Times New Roman"/>
                 <w:b/>
                 <w:bCs/>
-                <w:sz w:val="17"/>
+                <w:sz w:val="16"/>
               </w:rPr>
               <w:t xml:space="preserve">Backslopes (θ_align &lt; -0.3)</w:t>
             </w:r>
@@ -25545,7 +25545,7 @@
         </w:tc>
         <w:tc>
           <w:tcPr>
-            <w:tcW w:type="dxa" w:w="850"/>
+            <w:tcW w:type="dxa" w:w="794"/>
             <w:vAlign w:val="center"/>
           </w:tcPr>
           <w:p>
@@ -25559,7 +25559,7 @@
                 <w:rFonts w:ascii="Times New Roman" w:hAnsi="Times New Roman" w:eastAsia="Times New Roman"/>
                 <w:b/>
                 <w:bCs/>
-                <w:sz w:val="17"/>
+                <w:sz w:val="16"/>
               </w:rPr>
               <w:t xml:space="preserve">5,222</w:t>
             </w:r>
@@ -25567,7 +25567,7 @@
         </w:tc>
         <w:tc>
           <w:tcPr>
-            <w:tcW w:type="dxa" w:w="907"/>
+            <w:tcW w:type="dxa" w:w="964"/>
             <w:vAlign w:val="center"/>
           </w:tcPr>
           <w:p>
@@ -25581,7 +25581,7 @@
                 <w:rFonts w:ascii="Times New Roman" w:hAnsi="Times New Roman" w:eastAsia="Times New Roman"/>
                 <w:b/>
                 <w:bCs/>
-                <w:sz w:val="17"/>
+                <w:sz w:val="16"/>
               </w:rPr>
               <w:t xml:space="preserve">53.42%</w:t>
             </w:r>
@@ -25589,7 +25589,7 @@
         </w:tc>
         <w:tc>
           <w:tcPr>
-            <w:tcW w:type="dxa" w:w="907"/>
+            <w:tcW w:type="dxa" w:w="964"/>
             <w:vAlign w:val="center"/>
           </w:tcPr>
           <w:p>
@@ -25603,7 +25603,7 @@
                 <w:rFonts w:ascii="Times New Roman" w:hAnsi="Times New Roman" w:eastAsia="Times New Roman"/>
                 <w:b/>
                 <w:bCs/>
-                <w:sz w:val="17"/>
+                <w:sz w:val="16"/>
               </w:rPr>
               <w:t xml:space="preserve">52.36%</w:t>
             </w:r>
@@ -25611,7 +25611,7 @@
         </w:tc>
         <w:tc>
           <w:tcPr>
-            <w:tcW w:type="dxa" w:w="907"/>
+            <w:tcW w:type="dxa" w:w="964"/>
             <w:vAlign w:val="center"/>
           </w:tcPr>
           <w:p>
@@ -25623,7 +25623,7 @@
             <w:r>
               <w:rPr>
                 <w:rFonts w:ascii="Times New Roman" w:hAnsi="Times New Roman" w:eastAsia="Times New Roman"/>
-                <w:sz w:val="17"/>
+                <w:sz w:val="16"/>
               </w:rPr>
               <w:t xml:space="preserve">48.33%</w:t>
             </w:r>
@@ -25631,7 +25631,7 @@
         </w:tc>
         <w:tc>
           <w:tcPr>
-            <w:tcW w:type="dxa" w:w="907"/>
+            <w:tcW w:type="dxa" w:w="964"/>
             <w:vAlign w:val="center"/>
           </w:tcPr>
           <w:p>
@@ -25643,7 +25643,7 @@
             <w:r>
               <w:rPr>
                 <w:rFonts w:ascii="Times New Roman" w:hAnsi="Times New Roman" w:eastAsia="Times New Roman"/>
-                <w:sz w:val="17"/>
+                <w:sz w:val="16"/>
               </w:rPr>
               <w:t xml:space="preserve">38.41%</w:t>
             </w:r>
@@ -25651,7 +25651,7 @@
         </w:tc>
         <w:tc>
           <w:tcPr>
-            <w:tcW w:type="dxa" w:w="794"/>
+            <w:tcW w:type="dxa" w:w="964"/>
             <w:vAlign w:val="center"/>
           </w:tcPr>
           <w:p>
@@ -25665,7 +25665,7 @@
                 <w:rFonts w:ascii="Times New Roman" w:hAnsi="Times New Roman" w:eastAsia="Times New Roman"/>
                 <w:b/>
                 <w:bCs/>
-                <w:sz w:val="17"/>
+                <w:sz w:val="16"/>
               </w:rPr>
               <w:t xml:space="preserve">+5.09%</w:t>
             </w:r>
@@ -25699,7 +25699,7 @@
             <w:r>
               <w:rPr>
                 <w:rFonts w:ascii="Times New Roman" w:hAnsi="Times New Roman" w:eastAsia="Times New Roman"/>
-                <w:sz w:val="17"/>
+                <w:sz w:val="16"/>
               </w:rPr>
               <w:t xml:space="preserve">Runout &amp; Valleys (&lt; 25°)</w:t>
             </w:r>
@@ -25707,7 +25707,7 @@
         </w:tc>
         <w:tc>
           <w:tcPr>
-            <w:tcW w:type="dxa" w:w="850"/>
+            <w:tcW w:type="dxa" w:w="794"/>
             <w:vAlign w:val="center"/>
           </w:tcPr>
           <w:p>
@@ -25719,7 +25719,7 @@
             <w:r>
               <w:rPr>
                 <w:rFonts w:ascii="Times New Roman" w:hAnsi="Times New Roman" w:eastAsia="Times New Roman"/>
-                <w:sz w:val="17"/>
+                <w:sz w:val="16"/>
               </w:rPr>
               <w:t xml:space="preserve">6,501</w:t>
             </w:r>
@@ -25727,7 +25727,7 @@
         </w:tc>
         <w:tc>
           <w:tcPr>
-            <w:tcW w:type="dxa" w:w="907"/>
+            <w:tcW w:type="dxa" w:w="964"/>
             <w:vAlign w:val="center"/>
           </w:tcPr>
           <w:p>
@@ -25739,7 +25739,7 @@
             <w:r>
               <w:rPr>
                 <w:rFonts w:ascii="Times New Roman" w:hAnsi="Times New Roman" w:eastAsia="Times New Roman"/>
-                <w:sz w:val="17"/>
+                <w:sz w:val="16"/>
               </w:rPr>
               <w:t xml:space="preserve">45.97%</w:t>
             </w:r>
@@ -25747,7 +25747,7 @@
         </w:tc>
         <w:tc>
           <w:tcPr>
-            <w:tcW w:type="dxa" w:w="907"/>
+            <w:tcW w:type="dxa" w:w="964"/>
             <w:vAlign w:val="center"/>
           </w:tcPr>
           <w:p>
@@ -25759,7 +25759,7 @@
             <w:r>
               <w:rPr>
                 <w:rFonts w:ascii="Times New Roman" w:hAnsi="Times New Roman" w:eastAsia="Times New Roman"/>
-                <w:sz w:val="17"/>
+                <w:sz w:val="16"/>
               </w:rPr>
               <w:t xml:space="preserve">38.49%</w:t>
             </w:r>
@@ -25767,7 +25767,7 @@
         </w:tc>
         <w:tc>
           <w:tcPr>
-            <w:tcW w:type="dxa" w:w="907"/>
+            <w:tcW w:type="dxa" w:w="964"/>
             <w:vAlign w:val="center"/>
           </w:tcPr>
           <w:p>
@@ -25779,7 +25779,7 @@
             <w:r>
               <w:rPr>
                 <w:rFonts w:ascii="Times New Roman" w:hAnsi="Times New Roman" w:eastAsia="Times New Roman"/>
-                <w:sz w:val="17"/>
+                <w:sz w:val="16"/>
               </w:rPr>
               <w:t xml:space="preserve">38.22%</w:t>
             </w:r>
@@ -25787,7 +25787,7 @@
         </w:tc>
         <w:tc>
           <w:tcPr>
-            <w:tcW w:type="dxa" w:w="907"/>
+            <w:tcW w:type="dxa" w:w="964"/>
             <w:vAlign w:val="center"/>
           </w:tcPr>
           <w:p>
@@ -25799,7 +25799,7 @@
             <w:r>
               <w:rPr>
                 <w:rFonts w:ascii="Times New Roman" w:hAnsi="Times New Roman" w:eastAsia="Times New Roman"/>
-                <w:sz w:val="17"/>
+                <w:sz w:val="16"/>
               </w:rPr>
               <w:t xml:space="preserve">28.40%</w:t>
             </w:r>
@@ -25807,7 +25807,7 @@
         </w:tc>
         <w:tc>
           <w:tcPr>
-            <w:tcW w:type="dxa" w:w="794"/>
+            <w:tcW w:type="dxa" w:w="964"/>
             <w:vAlign w:val="center"/>
           </w:tcPr>
           <w:p>
@@ -25819,7 +25819,7 @@
             <w:r>
               <w:rPr>
                 <w:rFonts w:ascii="Times New Roman" w:hAnsi="Times New Roman" w:eastAsia="Times New Roman"/>
-                <w:sz w:val="17"/>
+                <w:sz w:val="16"/>
               </w:rPr>
               <w:t xml:space="preserve">+7.75%</w:t>
             </w:r>
@@ -25853,7 +25853,7 @@
             <w:r>
               <w:rPr>
                 <w:rFonts w:ascii="Times New Roman" w:hAnsi="Times New Roman" w:eastAsia="Times New Roman"/>
-                <w:sz w:val="17"/>
+                <w:sz w:val="16"/>
               </w:rPr>
               <w:t xml:space="preserve">Avalanche Chutes (25°–45°)</w:t>
             </w:r>
@@ -25861,7 +25861,7 @@
         </w:tc>
         <w:tc>
           <w:tcPr>
-            <w:tcW w:type="dxa" w:w="850"/>
+            <w:tcW w:type="dxa" w:w="794"/>
             <w:vAlign w:val="center"/>
           </w:tcPr>
           <w:p>
@@ -25873,7 +25873,7 @@
             <w:r>
               <w:rPr>
                 <w:rFonts w:ascii="Times New Roman" w:hAnsi="Times New Roman" w:eastAsia="Times New Roman"/>
-                <w:sz w:val="17"/>
+                <w:sz w:val="16"/>
               </w:rPr>
               <w:t xml:space="preserve">15,875</w:t>
             </w:r>
@@ -25881,7 +25881,7 @@
         </w:tc>
         <w:tc>
           <w:tcPr>
-            <w:tcW w:type="dxa" w:w="907"/>
+            <w:tcW w:type="dxa" w:w="964"/>
             <w:vAlign w:val="center"/>
           </w:tcPr>
           <w:p>
@@ -25893,7 +25893,7 @@
             <w:r>
               <w:rPr>
                 <w:rFonts w:ascii="Times New Roman" w:hAnsi="Times New Roman" w:eastAsia="Times New Roman"/>
-                <w:sz w:val="17"/>
+                <w:sz w:val="16"/>
               </w:rPr>
               <w:t xml:space="preserve">55.82%</w:t>
             </w:r>
@@ -25901,7 +25901,7 @@
         </w:tc>
         <w:tc>
           <w:tcPr>
-            <w:tcW w:type="dxa" w:w="907"/>
+            <w:tcW w:type="dxa" w:w="964"/>
             <w:vAlign w:val="center"/>
           </w:tcPr>
           <w:p>
@@ -25913,7 +25913,7 @@
             <w:r>
               <w:rPr>
                 <w:rFonts w:ascii="Times New Roman" w:hAnsi="Times New Roman" w:eastAsia="Times New Roman"/>
-                <w:sz w:val="17"/>
+                <w:sz w:val="16"/>
               </w:rPr>
               <w:t xml:space="preserve">52.33%</w:t>
             </w:r>
@@ -25921,7 +25921,7 @@
         </w:tc>
         <w:tc>
           <w:tcPr>
-            <w:tcW w:type="dxa" w:w="907"/>
+            <w:tcW w:type="dxa" w:w="964"/>
             <w:vAlign w:val="center"/>
           </w:tcPr>
           <w:p>
@@ -25933,7 +25933,7 @@
             <w:r>
               <w:rPr>
                 <w:rFonts w:ascii="Times New Roman" w:hAnsi="Times New Roman" w:eastAsia="Times New Roman"/>
-                <w:sz w:val="17"/>
+                <w:sz w:val="16"/>
               </w:rPr>
               <w:t xml:space="preserve">56.25%</w:t>
             </w:r>
@@ -25941,7 +25941,7 @@
         </w:tc>
         <w:tc>
           <w:tcPr>
-            <w:tcW w:type="dxa" w:w="907"/>
+            <w:tcW w:type="dxa" w:w="964"/>
             <w:vAlign w:val="center"/>
           </w:tcPr>
           <w:p>
@@ -25953,7 +25953,7 @@
             <w:r>
               <w:rPr>
                 <w:rFonts w:ascii="Times New Roman" w:hAnsi="Times New Roman" w:eastAsia="Times New Roman"/>
-                <w:sz w:val="17"/>
+                <w:sz w:val="16"/>
               </w:rPr>
               <w:t xml:space="preserve">50.55%</w:t>
             </w:r>
@@ -25961,7 +25961,7 @@
         </w:tc>
         <w:tc>
           <w:tcPr>
-            <w:tcW w:type="dxa" w:w="794"/>
+            <w:tcW w:type="dxa" w:w="964"/>
             <w:vAlign w:val="center"/>
           </w:tcPr>
           <w:p>
@@ -25973,7 +25973,7 @@
             <w:r>
               <w:rPr>
                 <w:rFonts w:ascii="Times New Roman" w:hAnsi="Times New Roman" w:eastAsia="Times New Roman"/>
-                <w:sz w:val="17"/>
+                <w:sz w:val="16"/>
               </w:rPr>
               <w:t xml:space="preserve">-0.44%</w:t>
             </w:r>
@@ -26007,7 +26007,7 @@
             <w:r>
               <w:rPr>
                 <w:rFonts w:ascii="Times New Roman" w:hAnsi="Times New Roman" w:eastAsia="Times New Roman"/>
-                <w:sz w:val="17"/>
+                <w:sz w:val="16"/>
               </w:rPr>
               <w:t xml:space="preserve">Extreme Steep (&gt; 45°, Shadow)</w:t>
             </w:r>
@@ -26015,7 +26015,7 @@
         </w:tc>
         <w:tc>
           <w:tcPr>
-            <w:tcW w:type="dxa" w:w="850"/>
+            <w:tcW w:type="dxa" w:w="794"/>
             <w:vAlign w:val="center"/>
           </w:tcPr>
           <w:p>
@@ -26027,7 +26027,7 @@
             <w:r>
               <w:rPr>
                 <w:rFonts w:ascii="Times New Roman" w:hAnsi="Times New Roman" w:eastAsia="Times New Roman"/>
-                <w:sz w:val="17"/>
+                <w:sz w:val="16"/>
               </w:rPr>
               <w:t xml:space="preserve">203</w:t>
             </w:r>
@@ -26035,7 +26035,7 @@
         </w:tc>
         <w:tc>
           <w:tcPr>
-            <w:tcW w:type="dxa" w:w="907"/>
+            <w:tcW w:type="dxa" w:w="964"/>
             <w:vAlign w:val="center"/>
           </w:tcPr>
           <w:p>
@@ -26047,7 +26047,7 @@
             <w:r>
               <w:rPr>
                 <w:rFonts w:ascii="Times New Roman" w:hAnsi="Times New Roman" w:eastAsia="Times New Roman"/>
-                <w:sz w:val="17"/>
+                <w:sz w:val="16"/>
               </w:rPr>
               <w:t xml:space="preserve">8.85%</w:t>
             </w:r>
@@ -26055,7 +26055,7 @@
         </w:tc>
         <w:tc>
           <w:tcPr>
-            <w:tcW w:type="dxa" w:w="907"/>
+            <w:tcW w:type="dxa" w:w="964"/>
             <w:vAlign w:val="center"/>
           </w:tcPr>
           <w:p>
@@ -26067,7 +26067,7 @@
             <w:r>
               <w:rPr>
                 <w:rFonts w:ascii="Times New Roman" w:hAnsi="Times New Roman" w:eastAsia="Times New Roman"/>
-                <w:sz w:val="17"/>
+                <w:sz w:val="16"/>
               </w:rPr>
               <w:t xml:space="preserve">5.04%</w:t>
             </w:r>
@@ -26075,7 +26075,7 @@
         </w:tc>
         <w:tc>
           <w:tcPr>
-            <w:tcW w:type="dxa" w:w="907"/>
+            <w:tcW w:type="dxa" w:w="964"/>
             <w:vAlign w:val="center"/>
           </w:tcPr>
           <w:p>
@@ -26087,7 +26087,7 @@
             <w:r>
               <w:rPr>
                 <w:rFonts w:ascii="Times New Roman" w:hAnsi="Times New Roman" w:eastAsia="Times New Roman"/>
-                <w:sz w:val="17"/>
+                <w:sz w:val="16"/>
               </w:rPr>
               <w:t xml:space="preserve">16.65%</w:t>
             </w:r>
@@ -26095,7 +26095,7 @@
         </w:tc>
         <w:tc>
           <w:tcPr>
-            <w:tcW w:type="dxa" w:w="907"/>
+            <w:tcW w:type="dxa" w:w="964"/>
             <w:vAlign w:val="center"/>
           </w:tcPr>
           <w:p>
@@ -26107,7 +26107,7 @@
             <w:r>
               <w:rPr>
                 <w:rFonts w:ascii="Times New Roman" w:hAnsi="Times New Roman" w:eastAsia="Times New Roman"/>
-                <w:sz w:val="17"/>
+                <w:sz w:val="16"/>
               </w:rPr>
               <w:t xml:space="preserve">10.74%</w:t>
             </w:r>
@@ -26115,7 +26115,7 @@
         </w:tc>
         <w:tc>
           <w:tcPr>
-            <w:tcW w:type="dxa" w:w="794"/>
+            <w:tcW w:type="dxa" w:w="964"/>
             <w:vAlign w:val="center"/>
           </w:tcPr>
           <w:p>
@@ -26127,7 +26127,7 @@
             <w:r>
               <w:rPr>
                 <w:rFonts w:ascii="Times New Roman" w:hAnsi="Times New Roman" w:eastAsia="Times New Roman"/>
-                <w:sz w:val="17"/>
+                <w:sz w:val="16"/>
               </w:rPr>
               <w:t xml:space="preserve">-7.80%</w:t>
             </w:r>

</xml_diff>

<commit_message>
release: freeze v1.0.20 equivalent figure package
</commit_message>
<xml_diff>
--- a/submission/JMS_26-11479_Main_Manuscript_Anonymous.docx
+++ b/submission/JMS_26-11479_Main_Manuscript_Anonymous.docx
@@ -15867,7 +15867,7 @@
         </w:rPr>
         <w:drawing>
           <wp:inline>
-            <wp:extent cx="5334000" cy="3235236"/>
+            <wp:extent cx="5334000" cy="3233505"/>
             <wp:effectExtent b="0" l="0" r="0" t="0"/>
             <wp:docPr descr="" title="" id="27" name="Picture"/>
             <a:graphic>
@@ -15888,7 +15888,7 @@
                   <pic:spPr bwMode="auto">
                     <a:xfrm>
                       <a:off x="0" y="0"/>
-                      <a:ext cx="5334000" cy="3235236"/>
+                      <a:ext cx="5334000" cy="3233505"/>
                     </a:xfrm>
                     <a:prstGeom prst="rect">
                       <a:avLst/>
@@ -20886,7 +20886,7 @@
         </w:rPr>
         <w:drawing>
           <wp:inline>
-            <wp:extent cx="5334000" cy="3118499"/>
+            <wp:extent cx="5334000" cy="3116966"/>
             <wp:effectExtent b="0" l="0" r="0" t="0"/>
             <wp:docPr descr="" title="" id="32" name="Picture"/>
             <a:graphic>
@@ -20907,7 +20907,7 @@
                   <pic:spPr bwMode="auto">
                     <a:xfrm>
                       <a:off x="0" y="0"/>
-                      <a:ext cx="5334000" cy="3118499"/>
+                      <a:ext cx="5334000" cy="3116966"/>
                     </a:xfrm>
                     <a:prstGeom prst="rect">
                       <a:avLst/>
@@ -23517,7 +23517,7 @@
         </w:rPr>
         <w:drawing>
           <wp:inline>
-            <wp:extent cx="5334000" cy="3120873"/>
+            <wp:extent cx="5334000" cy="3125472"/>
             <wp:effectExtent b="0" l="0" r="0" t="0"/>
             <wp:docPr descr="" title="" id="36" name="Picture"/>
             <a:graphic>
@@ -23538,7 +23538,7 @@
                   <pic:spPr bwMode="auto">
                     <a:xfrm>
                       <a:off x="0" y="0"/>
-                      <a:ext cx="5334000" cy="3120873"/>
+                      <a:ext cx="5334000" cy="3125472"/>
                     </a:xfrm>
                     <a:prstGeom prst="rect">
                       <a:avLst/>

</xml_diff>

<commit_message>
release: freeze v1.0.21 publication-scale typography
</commit_message>
<xml_diff>
--- a/submission/JMS_26-11479_Main_Manuscript_Anonymous.docx
+++ b/submission/JMS_26-11479_Main_Manuscript_Anonymous.docx
@@ -8691,7 +8691,7 @@
         </w:rPr>
         <w:drawing>
           <wp:inline>
-            <wp:extent cx="5120640" cy="2566416"/>
+            <wp:extent cx="5652000" cy="2833153"/>
             <wp:effectExtent b="0" l="0" r="0" t="0"/>
             <wp:docPr descr="" title="" id="17" name="Picture"/>
             <a:graphic>
@@ -8712,7 +8712,7 @@
                   <pic:spPr bwMode="auto">
                     <a:xfrm>
                       <a:off x="0" y="0"/>
-                      <a:ext cx="5120640" cy="2566416"/>
+                      <a:ext cx="5652000" cy="2833153"/>
                     </a:xfrm>
                     <a:prstGeom prst="rect">
                       <a:avLst/>
@@ -23517,7 +23517,7 @@
         </w:rPr>
         <w:drawing>
           <wp:inline>
-            <wp:extent cx="5334000" cy="3125472"/>
+            <wp:extent cx="5334000" cy="3113239"/>
             <wp:effectExtent b="0" l="0" r="0" t="0"/>
             <wp:docPr descr="" title="" id="36" name="Picture"/>
             <a:graphic>
@@ -23538,7 +23538,7 @@
                   <pic:spPr bwMode="auto">
                     <a:xfrm>
                       <a:off x="0" y="0"/>
-                      <a:ext cx="5334000" cy="3125472"/>
+                      <a:ext cx="5334000" cy="3113239"/>
                     </a:xfrm>
                     <a:prstGeom prst="rect">
                       <a:avLst/>

</xml_diff>

<commit_message>
release: freeze v1.0.22 positive-padding typography
</commit_message>
<xml_diff>
--- a/submission/JMS_26-11479_Main_Manuscript_Anonymous.docx
+++ b/submission/JMS_26-11479_Main_Manuscript_Anonymous.docx
@@ -23517,7 +23517,7 @@
         </w:rPr>
         <w:drawing>
           <wp:inline>
-            <wp:extent cx="5334000" cy="3113239"/>
+            <wp:extent cx="5334000" cy="3093150"/>
             <wp:effectExtent b="0" l="0" r="0" t="0"/>
             <wp:docPr descr="" title="" id="36" name="Picture"/>
             <a:graphic>
@@ -23538,7 +23538,7 @@
                   <pic:spPr bwMode="auto">
                     <a:xfrm>
                       <a:off x="0" y="0"/>
-                      <a:ext cx="5334000" cy="3113239"/>
+                      <a:ext cx="5334000" cy="3093150"/>
                     </a:xfrm>
                     <a:prstGeom prst="rect">
                       <a:avLst/>

</xml_diff>